<commit_message>
added files in oscillators
</commit_message>
<xml_diff>
--- a/00_Basic_electronics/1_capacitor/01___capacitor_basics.docx
+++ b/00_Basic_electronics/1_capacitor/01___capacitor_basics.docx
@@ -36,6 +36,60 @@
             <w:r>
               <w:t>Explanation</w:t>
             </w:r>
+          </w:p>
+        </w:tc>
+      </w:tr>
+      <w:tr>
+        <w:tc>
+          <w:tcPr>
+            <w:tcW w:w="3119" w:type="dxa"/>
+          </w:tcPr>
+          <w:p/>
+        </w:tc>
+        <w:tc>
+          <w:tcPr>
+            <w:tcW w:w="12836" w:type="dxa"/>
+          </w:tcPr>
+          <w:p>
+            <w:pPr>
+              <w:ind w:right="-332"/>
+            </w:pPr>
+          </w:p>
+        </w:tc>
+      </w:tr>
+      <w:tr>
+        <w:tc>
+          <w:tcPr>
+            <w:tcW w:w="3119" w:type="dxa"/>
+          </w:tcPr>
+          <w:p/>
+        </w:tc>
+        <w:tc>
+          <w:tcPr>
+            <w:tcW w:w="12836" w:type="dxa"/>
+          </w:tcPr>
+          <w:p>
+            <w:pPr>
+              <w:ind w:right="-332"/>
+            </w:pPr>
+          </w:p>
+        </w:tc>
+      </w:tr>
+      <w:tr>
+        <w:tc>
+          <w:tcPr>
+            <w:tcW w:w="3119" w:type="dxa"/>
+          </w:tcPr>
+          <w:p/>
+        </w:tc>
+        <w:tc>
+          <w:tcPr>
+            <w:tcW w:w="12836" w:type="dxa"/>
+          </w:tcPr>
+          <w:p>
+            <w:pPr>
+              <w:ind w:right="-332"/>
+            </w:pPr>
           </w:p>
         </w:tc>
       </w:tr>
@@ -735,6 +789,7 @@
               <w:rPr>
                 <w:noProof/>
               </w:rPr>
+              <w:lastRenderedPageBreak/>
               <w:drawing>
                 <wp:inline distT="0" distB="0" distL="0" distR="0" wp14:anchorId="1B4D9ABE" wp14:editId="19E1FE38">
                   <wp:extent cx="2307000" cy="902335"/>
@@ -775,7 +830,6 @@
           <w:p/>
           <w:p>
             <w:r>
-              <w:lastRenderedPageBreak/>
               <w:t xml:space="preserve">Capacitor behaviour is freq dependent </w:t>
             </w:r>
           </w:p>
@@ -1123,6 +1177,7 @@
           <w:p/>
           <w:p>
             <w:r>
+              <w:lastRenderedPageBreak/>
               <w:t xml:space="preserve">Sometimes manufacturers mention </w:t>
             </w:r>
             <w:r>
@@ -1228,7 +1283,6 @@
                       <w:b/>
                       <w:bCs/>
                     </w:rPr>
-                    <w:lastRenderedPageBreak/>
                     <w:t>🔧</w:t>
                   </w:r>
                   <w:r>
@@ -1481,7 +1535,6 @@
                       <w:b/>
                       <w:bCs/>
                     </w:rPr>
-                    <w:lastRenderedPageBreak/>
                     <w:t>🛠️</w:t>
                   </w:r>
                   <w:r>
@@ -1727,6 +1780,7 @@
                       <w:b/>
                       <w:bCs/>
                     </w:rPr>
+                    <w:lastRenderedPageBreak/>
                     <w:t>Used in:</w:t>
                   </w:r>
                   <w:r>
@@ -1859,7 +1913,6 @@
                     </w:numPr>
                   </w:pPr>
                   <w:r>
-                    <w:lastRenderedPageBreak/>
                     <w:t xml:space="preserve">It </w:t>
                   </w:r>
                   <w:r>
@@ -2280,6 +2333,7 @@
                     <w:rPr>
                       <w:rFonts w:cstheme="minorHAnsi"/>
                     </w:rPr>
+                    <w:lastRenderedPageBreak/>
                     <w:t>If ESR is high, ripple increases and components heat up</w:t>
                   </w:r>
                 </w:p>
@@ -2831,6 +2885,7 @@
               <w:rPr>
                 <w:rFonts w:cstheme="minorHAnsi"/>
               </w:rPr>
+              <w:lastRenderedPageBreak/>
               <w:t>An electrolytic capacitor: 10 µF but takes 20 mm³ → VE = 0.5 µF/mm³</w:t>
             </w:r>
           </w:p>
@@ -3640,6 +3695,7 @@
               <w:rPr>
                 <w:rFonts w:eastAsiaTheme="minorEastAsia"/>
               </w:rPr>
+              <w:lastRenderedPageBreak/>
               <w:t>Total charge (Q) = tot capacitance * volt</w:t>
             </w:r>
             <w:r>
@@ -3972,6 +4028,7 @@
               <w:ind w:left="283"/>
             </w:pPr>
             <w:r>
+              <w:lastRenderedPageBreak/>
               <w:t xml:space="preserve">Here 5 </w:t>
             </w:r>
             <w:r>
@@ -4051,7 +4108,6 @@
               <w:ind w:left="283"/>
             </w:pPr>
             <w:r>
-              <w:lastRenderedPageBreak/>
               <w:t>After 2</w:t>
             </w:r>
             <w:r>
@@ -4149,15 +4205,7 @@
               <w:ind w:left="283"/>
             </w:pPr>
             <w:r>
-              <w:t xml:space="preserve">Note : as the voltage in capacitor increases the current decreases (as the capacitor blocks DC after being fully charges. </w:t>
-            </w:r>
-            <w:proofErr w:type="gramStart"/>
-            <w:r>
-              <w:t>So</w:t>
-            </w:r>
-            <w:proofErr w:type="gramEnd"/>
-            <w:r>
-              <w:t xml:space="preserve"> while charging it reduces the current flow by accumulating the charge)</w:t>
+              <w:t>Note : as the voltage in capacitor increases the current decreases (as the capacitor blocks DC after being fully charges. So while charging it reduces the current flow by accumulating the charge)</w:t>
             </w:r>
           </w:p>
           <w:p/>
@@ -4228,6 +4276,7 @@
               <w:rPr>
                 <w:noProof/>
               </w:rPr>
+              <w:lastRenderedPageBreak/>
               <w:drawing>
                 <wp:inline distT="0" distB="0" distL="0" distR="0" wp14:anchorId="74C9354A" wp14:editId="1BC1DEBE">
                   <wp:extent cx="3469005" cy="1608249"/>
@@ -4275,6 +4324,7 @@
           </w:tcPr>
           <w:p>
             <w:r>
+              <w:lastRenderedPageBreak/>
               <w:t>Capacitor , inductor and resistor behaviour with AC</w:t>
             </w:r>
           </w:p>
@@ -4321,14 +4371,8 @@
                 <w:numId w:val="21"/>
               </w:numPr>
             </w:pPr>
-            <w:proofErr w:type="gramStart"/>
-            <w:r>
-              <w:lastRenderedPageBreak/>
-              <w:t>Thus</w:t>
-            </w:r>
-            <w:proofErr w:type="gramEnd"/>
-            <w:r>
-              <w:t xml:space="preserve"> i</w:t>
+            <w:r>
+              <w:t>Thus i</w:t>
             </w:r>
             <w:r>
               <w:t>n</w:t>
@@ -4487,7 +4531,6 @@
           </w:tcPr>
           <w:p>
             <w:r>
-              <w:lastRenderedPageBreak/>
               <w:t>Capacitor power in AC circuits</w:t>
             </w:r>
           </w:p>
@@ -4707,7 +4750,6 @@
               </w:numPr>
             </w:pPr>
             <w:r>
-              <w:lastRenderedPageBreak/>
               <w:t>Formula:</w:t>
             </w:r>
           </w:p>
@@ -5215,7 +5257,6 @@
               </w:numPr>
             </w:pPr>
             <w:r>
-              <w:lastRenderedPageBreak/>
               <w:t xml:space="preserve">Voltage hits its peak </w:t>
             </w:r>
             <w:r>
@@ -6248,6 +6289,7 @@
               </w:numPr>
             </w:pPr>
             <w:r>
+              <w:lastRenderedPageBreak/>
               <w:t>X=</w:t>
             </w:r>
             <m:oMath>
@@ -6562,7 +6604,6 @@
           <w:p/>
           <w:p>
             <w:r>
-              <w:lastRenderedPageBreak/>
               <w:t xml:space="preserve">For a standard </w:t>
             </w:r>
             <w:r>
@@ -7088,6 +7129,7 @@
               </w:numPr>
             </w:pPr>
             <w:r>
+              <w:lastRenderedPageBreak/>
               <w:t xml:space="preserve">Circuit acts like an </w:t>
             </w:r>
             <w:r>
@@ -7933,6 +7975,9 @@
             </w:r>
             <w:r>
               <w:br/>
+            </w:r>
+            <w:r>
+              <w:lastRenderedPageBreak/>
               <w:t xml:space="preserve">→ AC current </w:t>
             </w:r>
             <w:r>
@@ -8355,6 +8400,7 @@
               </w:numPr>
             </w:pPr>
             <w:r>
+              <w:lastRenderedPageBreak/>
               <w:t>Band-stop filters</w:t>
             </w:r>
           </w:p>
@@ -8869,6 +8915,7 @@
                       <w:bCs/>
                       <w:noProof/>
                     </w:rPr>
+                    <w:lastRenderedPageBreak/>
                     <w:drawing>
                       <wp:inline distT="0" distB="0" distL="0" distR="0" wp14:anchorId="12C362CD" wp14:editId="6CB206FF">
                         <wp:extent cx="3543795" cy="1771897"/>
@@ -9320,7 +9367,6 @@
                     </w:numPr>
                   </w:pPr>
                   <w:r>
-                    <w:lastRenderedPageBreak/>
                     <w:t xml:space="preserve">At low freq  </w:t>
                   </w:r>
                   <m:oMath>
@@ -9443,6 +9489,7 @@
                     <w:rPr>
                       <w:noProof/>
                     </w:rPr>
+                    <w:lastRenderedPageBreak/>
                     <w:drawing>
                       <wp:inline distT="0" distB="0" distL="0" distR="0" wp14:anchorId="2B901CE0" wp14:editId="378829C2">
                         <wp:extent cx="3504146" cy="1771650"/>
@@ -9853,7 +9900,6 @@
                     </w:numPr>
                   </w:pPr>
                   <w:r>
-                    <w:lastRenderedPageBreak/>
                     <w:t>At low freq</w:t>
                   </w:r>
                   <w:r>
@@ -10020,16 +10066,8 @@
                     <w:rPr>
                       <w:rFonts w:eastAsiaTheme="minorEastAsia"/>
                     </w:rPr>
-                    <w:t xml:space="preserve">so no current flows and no voltage </w:t>
-                  </w:r>
-                  <w:proofErr w:type="gramStart"/>
-                  <w:r>
-                    <w:rPr>
-                      <w:rFonts w:eastAsiaTheme="minorEastAsia"/>
-                    </w:rPr>
-                    <w:t>occurs</w:t>
-                  </w:r>
-                  <w:proofErr w:type="gramEnd"/>
+                    <w:t>so no current flows and no voltage occurs</w:t>
+                  </w:r>
                   <w:r>
                     <w:rPr>
                       <w:rFonts w:eastAsiaTheme="minorEastAsia"/>
@@ -10076,6 +10114,7 @@
                     <w:rPr>
                       <w:noProof/>
                     </w:rPr>
+                    <w:lastRenderedPageBreak/>
                     <w:drawing>
                       <wp:inline distT="0" distB="0" distL="0" distR="0" wp14:anchorId="432B4494" wp14:editId="6DF2B2B0">
                         <wp:extent cx="2162175" cy="1166587"/>
@@ -10199,7 +10238,6 @@
                     <w:rPr>
                       <w:noProof/>
                     </w:rPr>
-                    <w:lastRenderedPageBreak/>
                     <w:drawing>
                       <wp:inline distT="0" distB="0" distL="0" distR="0" wp14:anchorId="7AC6955E" wp14:editId="2F5D2239">
                         <wp:extent cx="2028825" cy="1120396"/>
@@ -10414,6 +10452,7 @@
                     </w:rPr>
                   </w:pPr>
                   <w:r>
+                    <w:lastRenderedPageBreak/>
                     <w:t xml:space="preserve">Output waveform will lag from the input phase by </w:t>
                   </w:r>
                   <m:oMath>
@@ -10977,7 +11016,6 @@
                           </w:rPr>
                         </w:pPr>
                         <w:r>
-                          <w:lastRenderedPageBreak/>
                           <w:t xml:space="preserve">Hence in short, the output waveform (for input of Vin and f freq </w:t>
                         </w:r>
                         <w:r>
@@ -11197,7 +11235,6 @@
                             <w:b/>
                             <w:bCs/>
                           </w:rPr>
-                          <w:lastRenderedPageBreak/>
                           <w:t xml:space="preserve">For RL low pass filter </w:t>
                         </w:r>
                       </w:p>
@@ -12574,7 +12611,6 @@
                           </w:numPr>
                         </w:pPr>
                         <w:r>
-                          <w:lastRenderedPageBreak/>
                           <w:t>C = 100 nF</w:t>
                         </w:r>
                       </w:p>
@@ -13521,7 +13557,6 @@
                       <w:bCs/>
                       <w:i/>
                     </w:rPr>
-                    <w:lastRenderedPageBreak/>
                     <w:br/>
                   </w:r>
                 </w:p>
@@ -13588,6 +13623,7 @@
               <w:ind w:left="720" w:right="3609"/>
             </w:pPr>
             <w:r>
+              <w:lastRenderedPageBreak/>
               <w:t xml:space="preserve">3 types of passive hpf </w:t>
             </w:r>
           </w:p>
@@ -14945,16 +14981,8 @@
                     <w:rPr>
                       <w:rFonts w:eastAsiaTheme="minorEastAsia"/>
                     </w:rPr>
-                    <w:t xml:space="preserve">so no current flows and no voltage </w:t>
-                  </w:r>
-                  <w:proofErr w:type="gramStart"/>
-                  <w:r>
-                    <w:rPr>
-                      <w:rFonts w:eastAsiaTheme="minorEastAsia"/>
-                    </w:rPr>
-                    <w:t>occurs</w:t>
-                  </w:r>
-                  <w:proofErr w:type="gramEnd"/>
+                    <w:t>so no current flows and no voltage occurs</w:t>
+                  </w:r>
                   <w:r>
                     <w:rPr>
                       <w:rFonts w:eastAsiaTheme="minorEastAsia"/>
@@ -14993,6 +15021,7 @@
                     <w:rPr>
                       <w:u w:val="single"/>
                     </w:rPr>
+                    <w:lastRenderedPageBreak/>
                     <w:t xml:space="preserve">Ideal </w:t>
                   </w:r>
                   <w:r>
@@ -15077,7 +15106,6 @@
                     <w:rPr>
                       <w:noProof/>
                     </w:rPr>
-                    <w:lastRenderedPageBreak/>
                     <w:drawing>
                       <wp:inline distT="0" distB="0" distL="0" distR="0" wp14:anchorId="3712E0AE" wp14:editId="16A0BC0A">
                         <wp:extent cx="2296275" cy="1275306"/>
@@ -15181,6 +15209,7 @@
                 <w:p/>
                 <w:p>
                   <w:r>
+                    <w:lastRenderedPageBreak/>
                     <w:t>Before cutoff freq output will attenuate at the rate 20db/decade</w:t>
                   </w:r>
                 </w:p>
@@ -15553,7 +15582,6 @@
                             <w:rPr>
                               <w:rFonts w:ascii="Cambria Math" w:hAnsi="Cambria Math"/>
                             </w:rPr>
-                            <w:lastRenderedPageBreak/>
                             <m:t xml:space="preserve">θ=  </m:t>
                           </m:r>
                           <m:sSup>
@@ -16070,7 +16098,6 @@
                             <w:b/>
                             <w:bCs/>
                           </w:rPr>
-                          <w:lastRenderedPageBreak/>
                           <w:t xml:space="preserve">For RL </w:t>
                         </w:r>
                         <w:r>
@@ -16183,7 +16210,6 @@
                             <w:rPr>
                               <w:rFonts w:ascii="Cambria Math" w:hAnsi="Cambria Math"/>
                             </w:rPr>
-                            <w:lastRenderedPageBreak/>
                             <m:t xml:space="preserve">θ=  </m:t>
                           </m:r>
                           <m:sSup>
@@ -16831,7 +16857,6 @@
                 <w:b/>
                 <w:bCs/>
               </w:rPr>
-              <w:lastRenderedPageBreak/>
               <w:t>Vout is taken across the capacitor</w:t>
             </w:r>
             <w:r>
@@ -17783,7 +17808,6 @@
               <w:rPr>
                 <w:noProof/>
               </w:rPr>
-              <w:lastRenderedPageBreak/>
               <w:drawing>
                 <wp:inline distT="0" distB="0" distL="0" distR="0" wp14:anchorId="6586D0F5" wp14:editId="746DF1DF">
                   <wp:extent cx="1843420" cy="1076688"/>
@@ -18198,15 +18222,7 @@
               <w:sym w:font="Wingdings" w:char="F0E0"/>
             </w:r>
             <w:r>
-              <w:t xml:space="preserve"> at sudden input volt appears at the output</w:t>
-            </w:r>
-            <w:proofErr w:type="gramStart"/>
-            <w:r>
-              <w:t xml:space="preserve"> ..</w:t>
-            </w:r>
-            <w:proofErr w:type="gramEnd"/>
-            <w:r>
-              <w:t xml:space="preserve">however after sometime capacitor starts charging…making vout fall from </w:t>
+              <w:t xml:space="preserve"> at sudden input volt appears at the output ..however after sometime capacitor starts charging…making vout fall from </w:t>
             </w:r>
             <m:oMath>
               <m:sSub>
@@ -18268,6 +18284,7 @@
               <w:ind w:left="360"/>
             </w:pPr>
             <w:r>
+              <w:lastRenderedPageBreak/>
               <w:t xml:space="preserve">       - falling edge </w:t>
             </w:r>
             <w:r>
@@ -19263,7 +19280,6 @@
               <w:rPr>
                 <w:rFonts w:eastAsiaTheme="minorEastAsia"/>
               </w:rPr>
-              <w:lastRenderedPageBreak/>
               <w:t xml:space="preserve">So, it </w:t>
             </w:r>
             <w:r>
@@ -19815,6 +19831,7 @@
           </w:tcPr>
           <w:p>
             <w:r>
+              <w:lastRenderedPageBreak/>
               <w:t>RC delay (gate delay)</w:t>
             </w:r>
           </w:p>
@@ -19981,6 +19998,1736 @@
             <w:r>
               <w:t>Reduce signal fluctuation and improve ADC accuracy.</w:t>
             </w:r>
+          </w:p>
+        </w:tc>
+      </w:tr>
+      <w:tr>
+        <w:tc>
+          <w:tcPr>
+            <w:tcW w:w="3119" w:type="dxa"/>
+          </w:tcPr>
+          <w:p/>
+        </w:tc>
+        <w:tc>
+          <w:tcPr>
+            <w:tcW w:w="12836" w:type="dxa"/>
+          </w:tcPr>
+          <w:p>
+            <w:pPr>
+              <w:rPr>
+                <w:b/>
+                <w:bCs/>
+              </w:rPr>
+            </w:pPr>
+          </w:p>
+        </w:tc>
+      </w:tr>
+      <w:tr>
+        <w:tc>
+          <w:tcPr>
+            <w:tcW w:w="3119" w:type="dxa"/>
+          </w:tcPr>
+          <w:p>
+            <w:r>
+              <w:t>SFR – self resonating freq</w:t>
+            </w:r>
+          </w:p>
+        </w:tc>
+        <w:tc>
+          <w:tcPr>
+            <w:tcW w:w="12836" w:type="dxa"/>
+          </w:tcPr>
+          <w:p>
+            <w:pPr>
+              <w:rPr>
+                <w:b/>
+                <w:bCs/>
+              </w:rPr>
+            </w:pPr>
+          </w:p>
+          <w:p>
+            <w:pPr>
+              <w:rPr>
+                <w:b/>
+                <w:bCs/>
+              </w:rPr>
+            </w:pPr>
+          </w:p>
+          <w:p>
+            <w:pPr>
+              <w:rPr>
+                <w:b/>
+                <w:bCs/>
+              </w:rPr>
+            </w:pPr>
+            <w:r>
+              <w:rPr>
+                <w:noProof/>
+              </w:rPr>
+              <w:lastRenderedPageBreak/>
+              <w:drawing>
+                <wp:inline distT="0" distB="0" distL="0" distR="0" wp14:anchorId="7C144283" wp14:editId="30489E44">
+                  <wp:extent cx="5937885" cy="3432175"/>
+                  <wp:effectExtent l="0" t="0" r="5715" b="0"/>
+                  <wp:docPr id="890957963" name="Picture 1" descr="The Role of Resonant Capacitors in Power Electronics"/>
+                  <wp:cNvGraphicFramePr>
+                    <a:graphicFrameLocks xmlns:a="http://schemas.openxmlformats.org/drawingml/2006/main" noChangeAspect="1"/>
+                  </wp:cNvGraphicFramePr>
+                  <a:graphic xmlns:a="http://schemas.openxmlformats.org/drawingml/2006/main">
+                    <a:graphicData uri="http://schemas.openxmlformats.org/drawingml/2006/picture">
+                      <pic:pic xmlns:pic="http://schemas.openxmlformats.org/drawingml/2006/picture">
+                        <pic:nvPicPr>
+                          <pic:cNvPr id="0" name="Picture 1" descr="The Role of Resonant Capacitors in Power Electronics"/>
+                          <pic:cNvPicPr>
+                            <a:picLocks noChangeAspect="1" noChangeArrowheads="1"/>
+                          </pic:cNvPicPr>
+                        </pic:nvPicPr>
+                        <pic:blipFill>
+                          <a:blip r:embed="rId29">
+                            <a:extLst>
+                              <a:ext uri="{28A0092B-C50C-407E-A947-70E740481C1C}">
+                                <a14:useLocalDpi xmlns:a14="http://schemas.microsoft.com/office/drawing/2010/main" val="0"/>
+                              </a:ext>
+                            </a:extLst>
+                          </a:blip>
+                          <a:srcRect/>
+                          <a:stretch>
+                            <a:fillRect/>
+                          </a:stretch>
+                        </pic:blipFill>
+                        <pic:spPr bwMode="auto">
+                          <a:xfrm>
+                            <a:off x="0" y="0"/>
+                            <a:ext cx="5937885" cy="3432175"/>
+                          </a:xfrm>
+                          <a:prstGeom prst="rect">
+                            <a:avLst/>
+                          </a:prstGeom>
+                          <a:noFill/>
+                          <a:ln>
+                            <a:noFill/>
+                          </a:ln>
+                        </pic:spPr>
+                      </pic:pic>
+                    </a:graphicData>
+                  </a:graphic>
+                </wp:inline>
+              </w:drawing>
+            </w:r>
+          </w:p>
+          <w:p>
+            <w:pPr>
+              <w:rPr>
+                <w:b/>
+                <w:bCs/>
+              </w:rPr>
+            </w:pPr>
+          </w:p>
+          <w:p>
+            <w:pPr>
+              <w:rPr>
+                <w:b/>
+                <w:bCs/>
+              </w:rPr>
+            </w:pPr>
+            <w:r>
+              <w:rPr>
+                <w:b/>
+                <w:bCs/>
+              </w:rPr>
+              <w:t>What is capacitor SRF?</w:t>
+            </w:r>
+          </w:p>
+          <w:p>
+            <w:pPr>
+              <w:rPr>
+                <w:b/>
+                <w:bCs/>
+              </w:rPr>
+            </w:pPr>
+            <w:r>
+              <w:rPr>
+                <w:b/>
+                <w:bCs/>
+              </w:rPr>
+              <w:t>A real capacitor is not ideal. It has:</w:t>
+            </w:r>
+          </w:p>
+          <w:p>
+            <w:pPr>
+              <w:numPr>
+                <w:ilvl w:val="0"/>
+                <w:numId w:val="58"/>
+              </w:numPr>
+              <w:rPr>
+                <w:b/>
+                <w:bCs/>
+              </w:rPr>
+            </w:pPr>
+            <w:r>
+              <w:rPr>
+                <w:b/>
+                <w:bCs/>
+              </w:rPr>
+              <w:t>Capacitance C</w:t>
+            </w:r>
+          </w:p>
+          <w:p>
+            <w:pPr>
+              <w:numPr>
+                <w:ilvl w:val="0"/>
+                <w:numId w:val="58"/>
+              </w:numPr>
+              <w:rPr>
+                <w:b/>
+                <w:bCs/>
+              </w:rPr>
+            </w:pPr>
+            <w:r>
+              <w:rPr>
+                <w:b/>
+                <w:bCs/>
+              </w:rPr>
+              <w:t>ESR (loss)</w:t>
+            </w:r>
+          </w:p>
+          <w:p>
+            <w:pPr>
+              <w:numPr>
+                <w:ilvl w:val="0"/>
+                <w:numId w:val="58"/>
+              </w:numPr>
+              <w:rPr>
+                <w:b/>
+                <w:bCs/>
+              </w:rPr>
+            </w:pPr>
+            <w:r>
+              <w:rPr>
+                <w:b/>
+                <w:bCs/>
+              </w:rPr>
+              <w:t>ESL (Equivalent Series Inductance) from leads &amp; internal structure</w:t>
+            </w:r>
+          </w:p>
+          <w:p>
+            <w:pPr>
+              <w:rPr>
+                <w:b/>
+                <w:bCs/>
+              </w:rPr>
+            </w:pPr>
+            <w:r>
+              <w:rPr>
+                <w:b/>
+                <w:bCs/>
+              </w:rPr>
+              <w:t>So the real model is:</w:t>
+            </w:r>
+          </w:p>
+          <w:p>
+            <w:pPr>
+              <w:rPr>
+                <w:b/>
+                <w:bCs/>
+              </w:rPr>
+            </w:pPr>
+            <w:r>
+              <w:rPr>
+                <w:b/>
+                <w:bCs/>
+              </w:rPr>
+              <w:t>C in series with a tiny inductor (ESL)</w:t>
+            </w:r>
+          </w:p>
+          <w:p>
+            <w:pPr>
+              <w:rPr>
+                <w:b/>
+                <w:bCs/>
+              </w:rPr>
+            </w:pPr>
+            <w:r>
+              <w:rPr>
+                <w:b/>
+                <w:bCs/>
+              </w:rPr>
+              <w:t>At some frequency:</w:t>
+            </w:r>
+          </w:p>
+          <w:p>
+            <w:pPr>
+              <w:rPr>
+                <w:b/>
+                <w:bCs/>
+              </w:rPr>
+            </w:pPr>
+            <m:oMathPara>
+              <m:oMath>
+                <m:sSub>
+                  <m:sSubPr>
+                    <m:ctrlPr>
+                      <w:rPr>
+                        <w:rFonts w:ascii="Cambria Math" w:hAnsi="Cambria Math"/>
+                        <w:b/>
+                        <w:bCs/>
+                      </w:rPr>
+                    </m:ctrlPr>
+                  </m:sSubPr>
+                  <m:e>
+                    <m:r>
+                      <m:rPr>
+                        <m:sty m:val="bi"/>
+                      </m:rPr>
+                      <w:rPr>
+                        <w:rFonts w:ascii="Cambria Math" w:hAnsi="Cambria Math"/>
+                      </w:rPr>
+                      <m:t>f</m:t>
+                    </m:r>
+                  </m:e>
+                  <m:sub>
+                    <m:r>
+                      <m:rPr>
+                        <m:sty m:val="bi"/>
+                      </m:rPr>
+                      <w:rPr>
+                        <w:rFonts w:ascii="Cambria Math" w:hAnsi="Cambria Math"/>
+                      </w:rPr>
+                      <m:t>SRF</m:t>
+                    </m:r>
+                  </m:sub>
+                </m:sSub>
+                <m:r>
+                  <m:rPr>
+                    <m:sty m:val="bi"/>
+                  </m:rPr>
+                  <w:rPr>
+                    <w:rFonts w:ascii="Cambria Math" w:hAnsi="Cambria Math"/>
+                  </w:rPr>
+                  <m:t>=</m:t>
+                </m:r>
+                <m:f>
+                  <m:fPr>
+                    <m:ctrlPr>
+                      <w:rPr>
+                        <w:rFonts w:ascii="Cambria Math" w:hAnsi="Cambria Math"/>
+                        <w:b/>
+                        <w:bCs/>
+                      </w:rPr>
+                    </m:ctrlPr>
+                  </m:fPr>
+                  <m:num>
+                    <m:r>
+                      <m:rPr>
+                        <m:sty m:val="bi"/>
+                      </m:rPr>
+                      <w:rPr>
+                        <w:rFonts w:ascii="Cambria Math" w:hAnsi="Cambria Math"/>
+                      </w:rPr>
+                      <m:t>1</m:t>
+                    </m:r>
+                  </m:num>
+                  <m:den>
+                    <m:r>
+                      <m:rPr>
+                        <m:sty m:val="bi"/>
+                      </m:rPr>
+                      <w:rPr>
+                        <w:rFonts w:ascii="Cambria Math" w:hAnsi="Cambria Math"/>
+                      </w:rPr>
+                      <m:t>2</m:t>
+                    </m:r>
+                    <m:r>
+                      <m:rPr>
+                        <m:sty m:val="bi"/>
+                      </m:rPr>
+                      <w:rPr>
+                        <w:rFonts w:ascii="Cambria Math" w:hAnsi="Cambria Math"/>
+                      </w:rPr>
+                      <m:t>π</m:t>
+                    </m:r>
+                    <m:rad>
+                      <m:radPr>
+                        <m:degHide m:val="1"/>
+                        <m:ctrlPr>
+                          <w:rPr>
+                            <w:rFonts w:ascii="Cambria Math" w:hAnsi="Cambria Math"/>
+                            <w:b/>
+                            <w:bCs/>
+                          </w:rPr>
+                        </m:ctrlPr>
+                      </m:radPr>
+                      <m:deg/>
+                      <m:e>
+                        <m:sSub>
+                          <m:sSubPr>
+                            <m:ctrlPr>
+                              <w:rPr>
+                                <w:rFonts w:ascii="Cambria Math" w:hAnsi="Cambria Math"/>
+                                <w:b/>
+                                <w:bCs/>
+                              </w:rPr>
+                            </m:ctrlPr>
+                          </m:sSubPr>
+                          <m:e>
+                            <m:r>
+                              <m:rPr>
+                                <m:sty m:val="bi"/>
+                              </m:rPr>
+                              <w:rPr>
+                                <w:rFonts w:ascii="Cambria Math" w:hAnsi="Cambria Math"/>
+                              </w:rPr>
+                              <m:t>L</m:t>
+                            </m:r>
+                          </m:e>
+                          <m:sub>
+                            <m:r>
+                              <m:rPr>
+                                <m:sty m:val="bi"/>
+                              </m:rPr>
+                              <w:rPr>
+                                <w:rFonts w:ascii="Cambria Math" w:hAnsi="Cambria Math"/>
+                              </w:rPr>
+                              <m:t>ESL</m:t>
+                            </m:r>
+                          </m:sub>
+                        </m:sSub>
+                        <m:r>
+                          <m:rPr>
+                            <m:sty m:val="bi"/>
+                          </m:rPr>
+                          <w:rPr>
+                            <w:rFonts w:ascii="Cambria Math" w:hAnsi="Cambria Math"/>
+                          </w:rPr>
+                          <m:t>⋅C</m:t>
+                        </m:r>
+                      </m:e>
+                    </m:rad>
+                  </m:den>
+                </m:f>
+                <m:r>
+                  <w:rPr>
+                    <w:b/>
+                    <w:bCs/>
+                  </w:rPr>
+                  <w:br/>
+                </m:r>
+              </m:oMath>
+            </m:oMathPara>
+          </w:p>
+          <w:p>
+            <w:pPr>
+              <w:rPr>
+                <w:b/>
+                <w:bCs/>
+              </w:rPr>
+            </w:pPr>
+            <w:r>
+              <w:rPr>
+                <w:b/>
+                <w:bCs/>
+              </w:rPr>
+              <w:lastRenderedPageBreak/>
+              <w:t>That frequency is the capacitor’s self-resonant frequency.</w:t>
+            </w:r>
+          </w:p>
+          <w:p>
+            <w:pPr>
+              <w:rPr>
+                <w:b/>
+                <w:bCs/>
+              </w:rPr>
+            </w:pPr>
+            <w:r>
+              <w:rPr>
+                <w:b/>
+                <w:bCs/>
+              </w:rPr>
+              <w:pict w14:anchorId="0BDA9594">
+                <v:rect id="_x0000_i1076" style="width:0;height:1.5pt" o:hralign="center" o:hrstd="t" o:hr="t" fillcolor="#a0a0a0" stroked="f"/>
+              </w:pict>
+            </w:r>
+          </w:p>
+          <w:p>
+            <w:pPr>
+              <w:rPr>
+                <w:b/>
+                <w:bCs/>
+              </w:rPr>
+            </w:pPr>
+            <w:r>
+              <w:rPr>
+                <w:b/>
+                <w:bCs/>
+              </w:rPr>
+              <w:t>What happens at capacitor SRF?</w:t>
+            </w:r>
+          </w:p>
+          <w:tbl>
+            <w:tblPr>
+              <w:tblW w:w="0" w:type="auto"/>
+              <w:tblCellSpacing w:w="15" w:type="dxa"/>
+              <w:tblCellMar>
+                <w:top w:w="15" w:type="dxa"/>
+                <w:left w:w="15" w:type="dxa"/>
+                <w:bottom w:w="15" w:type="dxa"/>
+                <w:right w:w="15" w:type="dxa"/>
+              </w:tblCellMar>
+              <w:tblLook w:val="04A0" w:firstRow="1" w:lastRow="0" w:firstColumn="1" w:lastColumn="0" w:noHBand="0" w:noVBand="1"/>
+            </w:tblPr>
+            <w:tblGrid>
+              <w:gridCol w:w="1123"/>
+              <w:gridCol w:w="2458"/>
+            </w:tblGrid>
+            <w:tr>
+              <w:trPr>
+                <w:tblHeader/>
+                <w:tblCellSpacing w:w="15" w:type="dxa"/>
+              </w:trPr>
+              <w:tc>
+                <w:tcPr>
+                  <w:tcW w:w="0" w:type="auto"/>
+                  <w:vAlign w:val="center"/>
+                  <w:hideMark/>
+                </w:tcPr>
+                <w:p>
+                  <w:pPr>
+                    <w:spacing w:after="0" w:line="240" w:lineRule="auto"/>
+                    <w:rPr>
+                      <w:b/>
+                      <w:bCs/>
+                    </w:rPr>
+                  </w:pPr>
+                  <w:r>
+                    <w:rPr>
+                      <w:b/>
+                      <w:bCs/>
+                    </w:rPr>
+                    <w:t>Frequency</w:t>
+                  </w:r>
+                </w:p>
+              </w:tc>
+              <w:tc>
+                <w:tcPr>
+                  <w:tcW w:w="0" w:type="auto"/>
+                  <w:vAlign w:val="center"/>
+                  <w:hideMark/>
+                </w:tcPr>
+                <w:p>
+                  <w:pPr>
+                    <w:spacing w:after="0" w:line="240" w:lineRule="auto"/>
+                    <w:rPr>
+                      <w:b/>
+                      <w:bCs/>
+                    </w:rPr>
+                  </w:pPr>
+                  <w:r>
+                    <w:rPr>
+                      <w:b/>
+                      <w:bCs/>
+                    </w:rPr>
+                    <w:t xml:space="preserve">Capacitor </w:t>
+                  </w:r>
+                  <w:proofErr w:type="spellStart"/>
+                  <w:r>
+                    <w:rPr>
+                      <w:b/>
+                      <w:bCs/>
+                    </w:rPr>
+                    <w:t>behavior</w:t>
+                  </w:r>
+                  <w:proofErr w:type="spellEnd"/>
+                </w:p>
+              </w:tc>
+            </w:tr>
+            <w:tr>
+              <w:trPr>
+                <w:tblCellSpacing w:w="15" w:type="dxa"/>
+              </w:trPr>
+              <w:tc>
+                <w:tcPr>
+                  <w:tcW w:w="0" w:type="auto"/>
+                  <w:vAlign w:val="center"/>
+                  <w:hideMark/>
+                </w:tcPr>
+                <w:p>
+                  <w:pPr>
+                    <w:spacing w:after="0" w:line="240" w:lineRule="auto"/>
+                    <w:rPr>
+                      <w:b/>
+                      <w:bCs/>
+                    </w:rPr>
+                  </w:pPr>
+                  <w:r>
+                    <w:rPr>
+                      <w:b/>
+                      <w:bCs/>
+                    </w:rPr>
+                    <w:t>Below SRF</w:t>
+                  </w:r>
+                </w:p>
+              </w:tc>
+              <w:tc>
+                <w:tcPr>
+                  <w:tcW w:w="0" w:type="auto"/>
+                  <w:vAlign w:val="center"/>
+                  <w:hideMark/>
+                </w:tcPr>
+                <w:p>
+                  <w:pPr>
+                    <w:spacing w:after="0" w:line="240" w:lineRule="auto"/>
+                    <w:rPr>
+                      <w:b/>
+                      <w:bCs/>
+                    </w:rPr>
+                  </w:pPr>
+                  <w:r>
+                    <w:rPr>
+                      <w:rFonts w:ascii="Segoe UI Symbol" w:hAnsi="Segoe UI Symbol" w:cs="Segoe UI Symbol"/>
+                      <w:b/>
+                      <w:bCs/>
+                    </w:rPr>
+                    <w:t>✔</w:t>
+                  </w:r>
+                  <w:r>
+                    <w:rPr>
+                      <w:b/>
+                      <w:bCs/>
+                    </w:rPr>
+                    <w:t xml:space="preserve"> Capacitive</w:t>
+                  </w:r>
+                </w:p>
+              </w:tc>
+            </w:tr>
+            <w:tr>
+              <w:trPr>
+                <w:tblCellSpacing w:w="15" w:type="dxa"/>
+              </w:trPr>
+              <w:tc>
+                <w:tcPr>
+                  <w:tcW w:w="0" w:type="auto"/>
+                  <w:vAlign w:val="center"/>
+                  <w:hideMark/>
+                </w:tcPr>
+                <w:p>
+                  <w:pPr>
+                    <w:spacing w:after="0" w:line="240" w:lineRule="auto"/>
+                    <w:rPr>
+                      <w:b/>
+                      <w:bCs/>
+                    </w:rPr>
+                  </w:pPr>
+                  <w:r>
+                    <w:rPr>
+                      <w:b/>
+                      <w:bCs/>
+                    </w:rPr>
+                    <w:t>At SRF</w:t>
+                  </w:r>
+                </w:p>
+              </w:tc>
+              <w:tc>
+                <w:tcPr>
+                  <w:tcW w:w="0" w:type="auto"/>
+                  <w:vAlign w:val="center"/>
+                  <w:hideMark/>
+                </w:tcPr>
+                <w:p>
+                  <w:pPr>
+                    <w:spacing w:after="0" w:line="240" w:lineRule="auto"/>
+                    <w:rPr>
+                      <w:b/>
+                      <w:bCs/>
+                    </w:rPr>
+                  </w:pPr>
+                  <w:r>
+                    <w:rPr>
+                      <w:rFonts w:ascii="Segoe UI Symbol" w:hAnsi="Segoe UI Symbol" w:cs="Segoe UI Symbol"/>
+                      <w:b/>
+                      <w:bCs/>
+                    </w:rPr>
+                    <w:t>⚠</w:t>
+                  </w:r>
+                  <w:r>
+                    <w:rPr>
+                      <w:b/>
+                      <w:bCs/>
+                    </w:rPr>
+                    <w:t xml:space="preserve"> Impedance minimum</w:t>
+                  </w:r>
+                </w:p>
+              </w:tc>
+            </w:tr>
+            <w:tr>
+              <w:trPr>
+                <w:tblCellSpacing w:w="15" w:type="dxa"/>
+              </w:trPr>
+              <w:tc>
+                <w:tcPr>
+                  <w:tcW w:w="0" w:type="auto"/>
+                  <w:vAlign w:val="center"/>
+                  <w:hideMark/>
+                </w:tcPr>
+                <w:p>
+                  <w:pPr>
+                    <w:spacing w:after="0" w:line="240" w:lineRule="auto"/>
+                    <w:rPr>
+                      <w:b/>
+                      <w:bCs/>
+                    </w:rPr>
+                  </w:pPr>
+                  <w:r>
+                    <w:rPr>
+                      <w:b/>
+                      <w:bCs/>
+                    </w:rPr>
+                    <w:t>Above SRF</w:t>
+                  </w:r>
+                </w:p>
+              </w:tc>
+              <w:tc>
+                <w:tcPr>
+                  <w:tcW w:w="0" w:type="auto"/>
+                  <w:vAlign w:val="center"/>
+                  <w:hideMark/>
+                </w:tcPr>
+                <w:p>
+                  <w:pPr>
+                    <w:spacing w:after="0" w:line="240" w:lineRule="auto"/>
+                    <w:rPr>
+                      <w:b/>
+                      <w:bCs/>
+                    </w:rPr>
+                  </w:pPr>
+                  <w:r>
+                    <w:rPr>
+                      <w:rFonts w:ascii="Segoe UI Emoji" w:hAnsi="Segoe UI Emoji" w:cs="Segoe UI Emoji"/>
+                      <w:b/>
+                      <w:bCs/>
+                    </w:rPr>
+                    <w:t>❌</w:t>
+                  </w:r>
+                  <w:r>
+                    <w:rPr>
+                      <w:b/>
+                      <w:bCs/>
+                    </w:rPr>
+                    <w:t xml:space="preserve"> Inductive</w:t>
+                  </w:r>
+                </w:p>
+              </w:tc>
+            </w:tr>
+          </w:tbl>
+          <w:p>
+            <w:pPr>
+              <w:rPr>
+                <w:b/>
+                <w:bCs/>
+              </w:rPr>
+            </w:pPr>
+            <w:r>
+              <w:rPr>
+                <w:b/>
+                <w:bCs/>
+              </w:rPr>
+              <w:t>So above SRF, your capacitor starts behaving like an inductor.</w:t>
+            </w:r>
+          </w:p>
+          <w:p>
+            <w:pPr>
+              <w:rPr>
+                <w:b/>
+                <w:bCs/>
+              </w:rPr>
+            </w:pPr>
+            <w:r>
+              <w:rPr>
+                <w:b/>
+                <w:bCs/>
+              </w:rPr>
+              <w:pict w14:anchorId="5BA911D3">
+                <v:rect id="_x0000_i1077" style="width:0;height:1.5pt" o:hralign="center" o:hrstd="t" o:hr="t" fillcolor="#a0a0a0" stroked="f"/>
+              </w:pict>
+            </w:r>
+          </w:p>
+          <w:p>
+            <w:pPr>
+              <w:rPr>
+                <w:b/>
+                <w:bCs/>
+              </w:rPr>
+            </w:pPr>
+            <w:r>
+              <w:rPr>
+                <w:b/>
+                <w:bCs/>
+              </w:rPr>
+              <w:t>Why capacitor SRF usually hurts less than inductor SRF</w:t>
+            </w:r>
+          </w:p>
+          <w:p>
+            <w:pPr>
+              <w:numPr>
+                <w:ilvl w:val="0"/>
+                <w:numId w:val="59"/>
+              </w:numPr>
+              <w:rPr>
+                <w:b/>
+                <w:bCs/>
+              </w:rPr>
+            </w:pPr>
+            <w:r>
+              <w:rPr>
+                <w:b/>
+                <w:bCs/>
+              </w:rPr>
+              <w:t>ESL is extremely small (</w:t>
+            </w:r>
+            <w:proofErr w:type="spellStart"/>
+            <w:r>
+              <w:rPr>
+                <w:b/>
+                <w:bCs/>
+              </w:rPr>
+              <w:t>nH</w:t>
+            </w:r>
+            <w:proofErr w:type="spellEnd"/>
+            <w:r>
+              <w:rPr>
+                <w:b/>
+                <w:bCs/>
+              </w:rPr>
+              <w:t xml:space="preserve"> range)</w:t>
+            </w:r>
+          </w:p>
+          <w:p>
+            <w:pPr>
+              <w:numPr>
+                <w:ilvl w:val="0"/>
+                <w:numId w:val="59"/>
+              </w:numPr>
+              <w:rPr>
+                <w:b/>
+                <w:bCs/>
+              </w:rPr>
+            </w:pPr>
+            <w:r>
+              <w:rPr>
+                <w:b/>
+                <w:bCs/>
+              </w:rPr>
+              <w:t>So SRF is very high</w:t>
+            </w:r>
+          </w:p>
+          <w:p>
+            <w:pPr>
+              <w:numPr>
+                <w:ilvl w:val="0"/>
+                <w:numId w:val="59"/>
+              </w:numPr>
+              <w:rPr>
+                <w:b/>
+                <w:bCs/>
+              </w:rPr>
+            </w:pPr>
+            <w:r>
+              <w:rPr>
+                <w:b/>
+                <w:bCs/>
+              </w:rPr>
+              <w:t>Often hundreds of MHz to GHz</w:t>
+            </w:r>
+          </w:p>
+          <w:p>
+            <w:pPr>
+              <w:rPr>
+                <w:b/>
+                <w:bCs/>
+              </w:rPr>
+            </w:pPr>
+            <w:r>
+              <w:rPr>
+                <w:b/>
+                <w:bCs/>
+              </w:rPr>
+              <w:t>That’s why in many LC oscillators:</w:t>
+            </w:r>
+          </w:p>
+          <w:p>
+            <w:pPr>
+              <w:numPr>
+                <w:ilvl w:val="0"/>
+                <w:numId w:val="60"/>
+              </w:numPr>
+              <w:rPr>
+                <w:b/>
+                <w:bCs/>
+              </w:rPr>
+            </w:pPr>
+            <w:r>
+              <w:rPr>
+                <w:b/>
+                <w:bCs/>
+              </w:rPr>
+              <w:t>Inductor SRF is the limiting factor</w:t>
+            </w:r>
+          </w:p>
+          <w:p>
+            <w:pPr>
+              <w:numPr>
+                <w:ilvl w:val="0"/>
+                <w:numId w:val="60"/>
+              </w:numPr>
+              <w:rPr>
+                <w:b/>
+                <w:bCs/>
+              </w:rPr>
+            </w:pPr>
+            <w:r>
+              <w:rPr>
+                <w:b/>
+                <w:bCs/>
+              </w:rPr>
+              <w:t>Capacitor SRF is rarely the bottleneck</w:t>
+            </w:r>
+          </w:p>
+          <w:p>
+            <w:pPr>
+              <w:rPr>
+                <w:b/>
+                <w:bCs/>
+              </w:rPr>
+            </w:pPr>
+            <w:r>
+              <w:rPr>
+                <w:b/>
+                <w:bCs/>
+              </w:rPr>
+              <w:pict w14:anchorId="001DBB4D">
+                <v:rect id="_x0000_i1078" style="width:0;height:1.5pt" o:hralign="center" o:hrstd="t" o:hr="t" fillcolor="#a0a0a0" stroked="f"/>
+              </w:pict>
+            </w:r>
+          </w:p>
+          <w:p>
+            <w:pPr>
+              <w:rPr>
+                <w:b/>
+                <w:bCs/>
+              </w:rPr>
+            </w:pPr>
+            <w:r>
+              <w:rPr>
+                <w:b/>
+                <w:bCs/>
+              </w:rPr>
+              <w:t>Typical SRF comparison</w:t>
+            </w:r>
+          </w:p>
+          <w:tbl>
+            <w:tblPr>
+              <w:tblW w:w="0" w:type="auto"/>
+              <w:tblCellSpacing w:w="15" w:type="dxa"/>
+              <w:tblCellMar>
+                <w:top w:w="15" w:type="dxa"/>
+                <w:left w:w="15" w:type="dxa"/>
+                <w:bottom w:w="15" w:type="dxa"/>
+                <w:right w:w="15" w:type="dxa"/>
+              </w:tblCellMar>
+              <w:tblLook w:val="04A0" w:firstRow="1" w:lastRow="0" w:firstColumn="1" w:lastColumn="0" w:noHBand="0" w:noVBand="1"/>
+            </w:tblPr>
+            <w:tblGrid>
+              <w:gridCol w:w="2156"/>
+              <w:gridCol w:w="1436"/>
+            </w:tblGrid>
+            <w:tr>
+              <w:trPr>
+                <w:tblHeader/>
+                <w:tblCellSpacing w:w="15" w:type="dxa"/>
+              </w:trPr>
+              <w:tc>
+                <w:tcPr>
+                  <w:tcW w:w="0" w:type="auto"/>
+                  <w:vAlign w:val="center"/>
+                  <w:hideMark/>
+                </w:tcPr>
+                <w:p>
+                  <w:pPr>
+                    <w:spacing w:after="0" w:line="240" w:lineRule="auto"/>
+                    <w:rPr>
+                      <w:b/>
+                      <w:bCs/>
+                    </w:rPr>
+                  </w:pPr>
+                  <w:r>
+                    <w:rPr>
+                      <w:b/>
+                      <w:bCs/>
+                    </w:rPr>
+                    <w:t>Component</w:t>
+                  </w:r>
+                </w:p>
+              </w:tc>
+              <w:tc>
+                <w:tcPr>
+                  <w:tcW w:w="0" w:type="auto"/>
+                  <w:vAlign w:val="center"/>
+                  <w:hideMark/>
+                </w:tcPr>
+                <w:p>
+                  <w:pPr>
+                    <w:spacing w:after="0" w:line="240" w:lineRule="auto"/>
+                    <w:rPr>
+                      <w:b/>
+                      <w:bCs/>
+                    </w:rPr>
+                  </w:pPr>
+                  <w:r>
+                    <w:rPr>
+                      <w:b/>
+                      <w:bCs/>
+                    </w:rPr>
+                    <w:t>Typical SRF</w:t>
+                  </w:r>
+                </w:p>
+              </w:tc>
+            </w:tr>
+            <w:tr>
+              <w:trPr>
+                <w:tblCellSpacing w:w="15" w:type="dxa"/>
+              </w:trPr>
+              <w:tc>
+                <w:tcPr>
+                  <w:tcW w:w="0" w:type="auto"/>
+                  <w:vAlign w:val="center"/>
+                  <w:hideMark/>
+                </w:tcPr>
+                <w:p>
+                  <w:pPr>
+                    <w:spacing w:after="0" w:line="240" w:lineRule="auto"/>
+                    <w:rPr>
+                      <w:b/>
+                      <w:bCs/>
+                    </w:rPr>
+                  </w:pPr>
+                  <w:r>
+                    <w:rPr>
+                      <w:b/>
+                      <w:bCs/>
+                    </w:rPr>
+                    <w:t xml:space="preserve">100 </w:t>
+                  </w:r>
+                  <w:proofErr w:type="spellStart"/>
+                  <w:r>
+                    <w:rPr>
+                      <w:b/>
+                      <w:bCs/>
+                    </w:rPr>
+                    <w:t>nH</w:t>
+                  </w:r>
+                  <w:proofErr w:type="spellEnd"/>
+                  <w:r>
+                    <w:rPr>
+                      <w:b/>
+                      <w:bCs/>
+                    </w:rPr>
+                    <w:t xml:space="preserve"> inductor</w:t>
+                  </w:r>
+                </w:p>
+              </w:tc>
+              <w:tc>
+                <w:tcPr>
+                  <w:tcW w:w="0" w:type="auto"/>
+                  <w:vAlign w:val="center"/>
+                  <w:hideMark/>
+                </w:tcPr>
+                <w:p>
+                  <w:pPr>
+                    <w:spacing w:after="0" w:line="240" w:lineRule="auto"/>
+                    <w:rPr>
+                      <w:b/>
+                      <w:bCs/>
+                    </w:rPr>
+                  </w:pPr>
+                  <w:r>
+                    <w:rPr>
+                      <w:b/>
+                      <w:bCs/>
+                    </w:rPr>
+                    <w:t>20–50 MHz</w:t>
+                  </w:r>
+                </w:p>
+              </w:tc>
+            </w:tr>
+            <w:tr>
+              <w:trPr>
+                <w:tblCellSpacing w:w="15" w:type="dxa"/>
+              </w:trPr>
+              <w:tc>
+                <w:tcPr>
+                  <w:tcW w:w="0" w:type="auto"/>
+                  <w:vAlign w:val="center"/>
+                  <w:hideMark/>
+                </w:tcPr>
+                <w:p>
+                  <w:pPr>
+                    <w:spacing w:after="0" w:line="240" w:lineRule="auto"/>
+                    <w:rPr>
+                      <w:b/>
+                      <w:bCs/>
+                    </w:rPr>
+                  </w:pPr>
+                  <w:r>
+                    <w:rPr>
+                      <w:b/>
+                      <w:bCs/>
+                    </w:rPr>
+                    <w:t>10 pF capacitor</w:t>
+                  </w:r>
+                </w:p>
+              </w:tc>
+              <w:tc>
+                <w:tcPr>
+                  <w:tcW w:w="0" w:type="auto"/>
+                  <w:vAlign w:val="center"/>
+                  <w:hideMark/>
+                </w:tcPr>
+                <w:p>
+                  <w:pPr>
+                    <w:spacing w:after="0" w:line="240" w:lineRule="auto"/>
+                    <w:rPr>
+                      <w:b/>
+                      <w:bCs/>
+                    </w:rPr>
+                  </w:pPr>
+                  <w:r>
+                    <w:rPr>
+                      <w:b/>
+                      <w:bCs/>
+                    </w:rPr>
+                    <w:t>&gt;1 GHz</w:t>
+                  </w:r>
+                </w:p>
+              </w:tc>
+            </w:tr>
+            <w:tr>
+              <w:trPr>
+                <w:tblCellSpacing w:w="15" w:type="dxa"/>
+              </w:trPr>
+              <w:tc>
+                <w:tcPr>
+                  <w:tcW w:w="0" w:type="auto"/>
+                  <w:vAlign w:val="center"/>
+                  <w:hideMark/>
+                </w:tcPr>
+                <w:p>
+                  <w:pPr>
+                    <w:spacing w:after="0" w:line="240" w:lineRule="auto"/>
+                    <w:rPr>
+                      <w:b/>
+                      <w:bCs/>
+                    </w:rPr>
+                  </w:pPr>
+                  <w:r>
+                    <w:rPr>
+                      <w:b/>
+                      <w:bCs/>
+                    </w:rPr>
+                    <w:t>100 pF capacitor</w:t>
+                  </w:r>
+                </w:p>
+              </w:tc>
+              <w:tc>
+                <w:tcPr>
+                  <w:tcW w:w="0" w:type="auto"/>
+                  <w:vAlign w:val="center"/>
+                  <w:hideMark/>
+                </w:tcPr>
+                <w:p>
+                  <w:pPr>
+                    <w:spacing w:after="0" w:line="240" w:lineRule="auto"/>
+                    <w:rPr>
+                      <w:b/>
+                      <w:bCs/>
+                    </w:rPr>
+                  </w:pPr>
+                  <w:r>
+                    <w:rPr>
+                      <w:b/>
+                      <w:bCs/>
+                    </w:rPr>
+                    <w:t>200–500 MHz</w:t>
+                  </w:r>
+                </w:p>
+              </w:tc>
+            </w:tr>
+            <w:tr>
+              <w:trPr>
+                <w:tblCellSpacing w:w="15" w:type="dxa"/>
+              </w:trPr>
+              <w:tc>
+                <w:tcPr>
+                  <w:tcW w:w="0" w:type="auto"/>
+                  <w:vAlign w:val="center"/>
+                  <w:hideMark/>
+                </w:tcPr>
+                <w:p>
+                  <w:pPr>
+                    <w:spacing w:after="0" w:line="240" w:lineRule="auto"/>
+                    <w:rPr>
+                      <w:b/>
+                      <w:bCs/>
+                    </w:rPr>
+                  </w:pPr>
+                  <w:r>
+                    <w:rPr>
+                      <w:b/>
+                      <w:bCs/>
+                    </w:rPr>
+                    <w:t>Electrolytic capacitor</w:t>
+                  </w:r>
+                </w:p>
+              </w:tc>
+              <w:tc>
+                <w:tcPr>
+                  <w:tcW w:w="0" w:type="auto"/>
+                  <w:vAlign w:val="center"/>
+                  <w:hideMark/>
+                </w:tcPr>
+                <w:p>
+                  <w:pPr>
+                    <w:spacing w:after="0" w:line="240" w:lineRule="auto"/>
+                    <w:rPr>
+                      <w:b/>
+                      <w:bCs/>
+                    </w:rPr>
+                  </w:pPr>
+                  <w:r>
+                    <w:rPr>
+                      <w:b/>
+                      <w:bCs/>
+                    </w:rPr>
+                    <w:t xml:space="preserve">&lt;1 MHz </w:t>
+                  </w:r>
+                  <w:r>
+                    <w:rPr>
+                      <w:rFonts w:ascii="Segoe UI Emoji" w:hAnsi="Segoe UI Emoji" w:cs="Segoe UI Emoji"/>
+                      <w:b/>
+                      <w:bCs/>
+                    </w:rPr>
+                    <w:t>❌</w:t>
+                  </w:r>
+                </w:p>
+              </w:tc>
+            </w:tr>
+          </w:tbl>
+          <w:p>
+            <w:pPr>
+              <w:rPr>
+                <w:b/>
+                <w:bCs/>
+              </w:rPr>
+            </w:pPr>
+            <w:r>
+              <w:rPr>
+                <w:b/>
+                <w:bCs/>
+              </w:rPr>
+              <w:pict w14:anchorId="0FA71ED1">
+                <v:rect id="_x0000_i1079" style="width:0;height:1.5pt" o:hralign="center" o:hrstd="t" o:hr="t" fillcolor="#a0a0a0" stroked="f"/>
+              </w:pict>
+            </w:r>
+          </w:p>
+          <w:p>
+            <w:pPr>
+              <w:rPr>
+                <w:b/>
+                <w:bCs/>
+              </w:rPr>
+            </w:pPr>
+            <w:r>
+              <w:rPr>
+                <w:b/>
+                <w:bCs/>
+              </w:rPr>
+              <w:t>Why NP0 / C0G capacitors are preferred</w:t>
+            </w:r>
+          </w:p>
+          <w:p>
+            <w:pPr>
+              <w:numPr>
+                <w:ilvl w:val="0"/>
+                <w:numId w:val="61"/>
+              </w:numPr>
+              <w:rPr>
+                <w:b/>
+                <w:bCs/>
+              </w:rPr>
+            </w:pPr>
+            <w:r>
+              <w:rPr>
+                <w:b/>
+                <w:bCs/>
+              </w:rPr>
+              <w:t>Very low ESL</w:t>
+            </w:r>
+          </w:p>
+          <w:p>
+            <w:pPr>
+              <w:numPr>
+                <w:ilvl w:val="0"/>
+                <w:numId w:val="61"/>
+              </w:numPr>
+              <w:rPr>
+                <w:b/>
+                <w:bCs/>
+              </w:rPr>
+            </w:pPr>
+            <w:r>
+              <w:rPr>
+                <w:b/>
+                <w:bCs/>
+              </w:rPr>
+              <w:t>Very low ESR</w:t>
+            </w:r>
+          </w:p>
+          <w:p>
+            <w:pPr>
+              <w:numPr>
+                <w:ilvl w:val="0"/>
+                <w:numId w:val="61"/>
+              </w:numPr>
+              <w:rPr>
+                <w:b/>
+                <w:bCs/>
+              </w:rPr>
+            </w:pPr>
+            <w:r>
+              <w:rPr>
+                <w:b/>
+                <w:bCs/>
+              </w:rPr>
+              <w:t>Stable dielectric</w:t>
+            </w:r>
+          </w:p>
+          <w:p>
+            <w:pPr>
+              <w:numPr>
+                <w:ilvl w:val="0"/>
+                <w:numId w:val="61"/>
+              </w:numPr>
+              <w:rPr>
+                <w:b/>
+                <w:bCs/>
+              </w:rPr>
+            </w:pPr>
+            <w:r>
+              <w:rPr>
+                <w:b/>
+                <w:bCs/>
+              </w:rPr>
+              <w:lastRenderedPageBreak/>
+              <w:t>High SRF</w:t>
+            </w:r>
+          </w:p>
+          <w:p>
+            <w:pPr>
+              <w:rPr>
+                <w:b/>
+                <w:bCs/>
+              </w:rPr>
+            </w:pPr>
+            <w:r>
+              <w:rPr>
+                <w:rFonts w:ascii="Segoe UI Emoji" w:hAnsi="Segoe UI Emoji" w:cs="Segoe UI Emoji"/>
+                <w:b/>
+                <w:bCs/>
+              </w:rPr>
+              <w:t>👉</w:t>
+            </w:r>
+            <w:r>
+              <w:rPr>
+                <w:b/>
+                <w:bCs/>
+              </w:rPr>
+              <w:t xml:space="preserve"> Electrolytics &amp; tantalums = oscillator killers</w:t>
+            </w:r>
+          </w:p>
+          <w:p>
+            <w:pPr>
+              <w:rPr>
+                <w:b/>
+                <w:bCs/>
+              </w:rPr>
+            </w:pPr>
+            <w:r>
+              <w:rPr>
+                <w:b/>
+                <w:bCs/>
+              </w:rPr>
+              <w:pict w14:anchorId="1955E0FE">
+                <v:rect id="_x0000_i1080" style="width:0;height:1.5pt" o:hralign="center" o:hrstd="t" o:hr="t" fillcolor="#a0a0a0" stroked="f"/>
+              </w:pict>
+            </w:r>
+          </w:p>
+          <w:p>
+            <w:pPr>
+              <w:rPr>
+                <w:b/>
+                <w:bCs/>
+              </w:rPr>
+            </w:pPr>
+            <w:r>
+              <w:rPr>
+                <w:b/>
+                <w:bCs/>
+              </w:rPr>
+              <w:t>Rule of thumb (same idea as inductors)</w:t>
+            </w:r>
+          </w:p>
+          <w:p>
+            <w:pPr>
+              <w:rPr>
+                <w:b/>
+                <w:bCs/>
+              </w:rPr>
+            </w:pPr>
+            <m:oMathPara>
+              <m:oMath>
+                <m:borderBox>
+                  <m:borderBoxPr>
+                    <m:ctrlPr>
+                      <w:rPr>
+                        <w:rFonts w:ascii="Cambria Math" w:hAnsi="Cambria Math"/>
+                        <w:b/>
+                        <w:bCs/>
+                      </w:rPr>
+                    </m:ctrlPr>
+                  </m:borderBoxPr>
+                  <m:e>
+                    <m:sSub>
+                      <m:sSubPr>
+                        <m:ctrlPr>
+                          <w:rPr>
+                            <w:rFonts w:ascii="Cambria Math" w:hAnsi="Cambria Math"/>
+                            <w:b/>
+                            <w:bCs/>
+                          </w:rPr>
+                        </m:ctrlPr>
+                      </m:sSubPr>
+                      <m:e>
+                        <m:r>
+                          <m:rPr>
+                            <m:sty m:val="bi"/>
+                          </m:rPr>
+                          <w:rPr>
+                            <w:rFonts w:ascii="Cambria Math" w:hAnsi="Cambria Math"/>
+                          </w:rPr>
+                          <m:t>f</m:t>
+                        </m:r>
+                      </m:e>
+                      <m:sub>
+                        <m:r>
+                          <m:rPr>
+                            <m:sty m:val="bi"/>
+                          </m:rPr>
+                          <w:rPr>
+                            <w:rFonts w:ascii="Cambria Math" w:hAnsi="Cambria Math"/>
+                          </w:rPr>
+                          <m:t>SRF</m:t>
+                        </m:r>
+                      </m:sub>
+                    </m:sSub>
+                    <m:r>
+                      <m:rPr>
+                        <m:sty m:val="bi"/>
+                      </m:rPr>
+                      <w:rPr>
+                        <w:rFonts w:ascii="Cambria Math" w:hAnsi="Cambria Math"/>
+                      </w:rPr>
+                      <m:t>≥5</m:t>
+                    </m:r>
+                    <m:r>
+                      <m:rPr>
+                        <m:nor/>
+                      </m:rPr>
+                      <w:rPr>
+                        <w:b/>
+                        <w:bCs/>
+                      </w:rPr>
+                      <m:t>–</m:t>
+                    </m:r>
+                    <m:r>
+                      <m:rPr>
+                        <m:sty m:val="bi"/>
+                      </m:rPr>
+                      <w:rPr>
+                        <w:rFonts w:ascii="Cambria Math" w:hAnsi="Cambria Math"/>
+                      </w:rPr>
+                      <m:t>10×</m:t>
+                    </m:r>
+                    <m:sSub>
+                      <m:sSubPr>
+                        <m:ctrlPr>
+                          <w:rPr>
+                            <w:rFonts w:ascii="Cambria Math" w:hAnsi="Cambria Math"/>
+                            <w:b/>
+                            <w:bCs/>
+                          </w:rPr>
+                        </m:ctrlPr>
+                      </m:sSubPr>
+                      <m:e>
+                        <m:r>
+                          <m:rPr>
+                            <m:sty m:val="bi"/>
+                          </m:rPr>
+                          <w:rPr>
+                            <w:rFonts w:ascii="Cambria Math" w:hAnsi="Cambria Math"/>
+                          </w:rPr>
+                          <m:t>f</m:t>
+                        </m:r>
+                      </m:e>
+                      <m:sub>
+                        <m:r>
+                          <m:rPr>
+                            <m:sty m:val="bi"/>
+                          </m:rPr>
+                          <w:rPr>
+                            <w:rFonts w:ascii="Cambria Math" w:hAnsi="Cambria Math"/>
+                          </w:rPr>
+                          <m:t>osc</m:t>
+                        </m:r>
+                      </m:sub>
+                    </m:sSub>
+                  </m:e>
+                </m:borderBox>
+                <m:r>
+                  <w:rPr>
+                    <w:b/>
+                    <w:bCs/>
+                  </w:rPr>
+                  <w:br/>
+                </m:r>
+              </m:oMath>
+            </m:oMathPara>
+          </w:p>
+          <w:p>
+            <w:pPr>
+              <w:rPr>
+                <w:b/>
+                <w:bCs/>
+              </w:rPr>
+            </w:pPr>
+            <w:r>
+              <w:rPr>
+                <w:b/>
+                <w:bCs/>
+              </w:rPr>
+              <w:t>(applies to both L and C, but L usually fails first)</w:t>
+            </w:r>
+          </w:p>
+          <w:p>
+            <w:pPr>
+              <w:rPr>
+                <w:b/>
+                <w:bCs/>
+              </w:rPr>
+            </w:pPr>
+            <w:r>
+              <w:rPr>
+                <w:b/>
+                <w:bCs/>
+              </w:rPr>
+              <w:pict w14:anchorId="0EA52070">
+                <v:rect id="_x0000_i1081" style="width:0;height:1.5pt" o:hralign="center" o:hrstd="t" o:hr="t" fillcolor="#a0a0a0" stroked="f"/>
+              </w:pict>
+            </w:r>
+          </w:p>
+          <w:p>
+            <w:pPr>
+              <w:rPr>
+                <w:b/>
+                <w:bCs/>
+              </w:rPr>
+            </w:pPr>
+            <w:r>
+              <w:rPr>
+                <w:b/>
+                <w:bCs/>
+              </w:rPr>
+              <w:t xml:space="preserve">Notes-ready one-liner </w:t>
+            </w:r>
+            <w:r>
+              <w:rPr>
+                <w:rFonts w:ascii="Segoe UI Emoji" w:hAnsi="Segoe UI Emoji" w:cs="Segoe UI Emoji"/>
+                <w:b/>
+                <w:bCs/>
+              </w:rPr>
+              <w:t>✍️</w:t>
+            </w:r>
+          </w:p>
+          <w:p>
+            <w:pPr>
+              <w:rPr>
+                <w:b/>
+                <w:bCs/>
+              </w:rPr>
+            </w:pPr>
+            <w:r>
+              <w:rPr>
+                <w:b/>
+                <w:bCs/>
+                <w:i/>
+                <w:iCs/>
+              </w:rPr>
+              <w:t>“Capacitors also exhibit self-resonant frequency due to parasitic inductance (ESL). Below SRF they behave capacitively; above SRF they behave inductively. In RF oscillators, capacitor SRF is usually much higher than the operating frequency and is rarely the limiting factor.”</w:t>
+            </w:r>
+          </w:p>
+          <w:p>
+            <w:pPr>
+              <w:rPr>
+                <w:b/>
+                <w:bCs/>
+              </w:rPr>
+            </w:pPr>
+            <w:r>
+              <w:rPr>
+                <w:b/>
+                <w:bCs/>
+              </w:rPr>
+              <w:pict w14:anchorId="6FDA1C24">
+                <v:rect id="_x0000_i1082" style="width:0;height:1.5pt" o:hralign="center" o:hrstd="t" o:hr="t" fillcolor="#a0a0a0" stroked="f"/>
+              </w:pict>
+            </w:r>
+          </w:p>
+          <w:p>
+            <w:pPr>
+              <w:rPr>
+                <w:b/>
+                <w:bCs/>
+              </w:rPr>
+            </w:pPr>
+            <w:r>
+              <w:rPr>
+                <w:b/>
+                <w:bCs/>
+              </w:rPr>
+              <w:t xml:space="preserve">Engineer’s intuition </w:t>
+            </w:r>
+            <w:r>
+              <w:rPr>
+                <w:rFonts w:ascii="Segoe UI Emoji" w:hAnsi="Segoe UI Emoji" w:cs="Segoe UI Emoji"/>
+                <w:b/>
+                <w:bCs/>
+              </w:rPr>
+              <w:t>🧠</w:t>
+            </w:r>
+          </w:p>
+          <w:p>
+            <w:pPr>
+              <w:numPr>
+                <w:ilvl w:val="0"/>
+                <w:numId w:val="62"/>
+              </w:numPr>
+              <w:rPr>
+                <w:b/>
+                <w:bCs/>
+              </w:rPr>
+            </w:pPr>
+            <w:r>
+              <w:rPr>
+                <w:b/>
+                <w:bCs/>
+              </w:rPr>
+              <w:t>Inductor SRF → parasitic C</w:t>
+            </w:r>
+          </w:p>
+          <w:p>
+            <w:pPr>
+              <w:numPr>
+                <w:ilvl w:val="0"/>
+                <w:numId w:val="62"/>
+              </w:numPr>
+              <w:rPr>
+                <w:b/>
+                <w:bCs/>
+              </w:rPr>
+            </w:pPr>
+            <w:r>
+              <w:rPr>
+                <w:b/>
+                <w:bCs/>
+              </w:rPr>
+              <w:t>Capacitor SRF → parasitic L</w:t>
+            </w:r>
+          </w:p>
+          <w:p>
+            <w:pPr>
+              <w:numPr>
+                <w:ilvl w:val="0"/>
+                <w:numId w:val="62"/>
+              </w:numPr>
+              <w:rPr>
+                <w:b/>
+                <w:bCs/>
+              </w:rPr>
+            </w:pPr>
+            <w:r>
+              <w:rPr>
+                <w:b/>
+                <w:bCs/>
+              </w:rPr>
+              <w:t>Every real component is an LC in disguise</w:t>
+            </w:r>
+          </w:p>
+          <w:p>
+            <w:pPr>
+              <w:rPr>
+                <w:b/>
+                <w:bCs/>
+              </w:rPr>
+            </w:pPr>
+          </w:p>
+        </w:tc>
+      </w:tr>
+      <w:tr>
+        <w:tc>
+          <w:tcPr>
+            <w:tcW w:w="3119" w:type="dxa"/>
+          </w:tcPr>
+          <w:p/>
+        </w:tc>
+        <w:tc>
+          <w:tcPr>
+            <w:tcW w:w="12836" w:type="dxa"/>
+          </w:tcPr>
+          <w:p>
+            <w:pPr>
+              <w:rPr>
+                <w:b/>
+                <w:bCs/>
+              </w:rPr>
+            </w:pPr>
+          </w:p>
+        </w:tc>
+      </w:tr>
+      <w:tr>
+        <w:tc>
+          <w:tcPr>
+            <w:tcW w:w="3119" w:type="dxa"/>
+          </w:tcPr>
+          <w:p/>
+        </w:tc>
+        <w:tc>
+          <w:tcPr>
+            <w:tcW w:w="12836" w:type="dxa"/>
+          </w:tcPr>
+          <w:p>
+            <w:pPr>
+              <w:rPr>
+                <w:b/>
+                <w:bCs/>
+              </w:rPr>
+            </w:pPr>
           </w:p>
         </w:tc>
       </w:tr>
@@ -20021,6 +21768,304 @@
 <file path=word/numbering.xml><?xml version="1.0" encoding="utf-8"?>
 <w:numbering xmlns:wpc="http://schemas.microsoft.com/office/word/2010/wordprocessingCanvas" xmlns:cx="http://schemas.microsoft.com/office/drawing/2014/chartex" xmlns:cx1="http://schemas.microsoft.com/office/drawing/2015/9/8/chartex" xmlns:cx2="http://schemas.microsoft.com/office/drawing/2015/10/21/chartex" xmlns:cx3="http://schemas.microsoft.com/office/drawing/2016/5/9/chartex" xmlns:cx4="http://schemas.microsoft.com/office/drawing/2016/5/10/chartex" xmlns:cx5="http://schemas.microsoft.com/office/drawing/2016/5/11/chartex" xmlns:cx6="http://schemas.microsoft.com/office/drawing/2016/5/12/chartex" xmlns:cx7="http://schemas.microsoft.com/office/drawing/2016/5/13/chartex" xmlns:cx8="http://schemas.microsoft.com/office/drawing/2016/5/14/chartex" xmlns:mc="http://schemas.openxmlformats.org/markup-compatibility/2006" xmlns:aink="http://schemas.microsoft.com/office/drawing/2016/ink" xmlns:am3d="http://schemas.microsoft.com/office/drawing/2017/model3d" xmlns:o="urn:schemas-microsoft-com:office:office" xmlns:oel="http://schemas.microsoft.com/office/2019/extlst" xmlns:r="http://schemas.openxmlformats.org/officeDocument/2006/relationships" xmlns:m="http://schemas.openxmlformats.org/officeDocument/2006/math" xmlns:v="urn:schemas-microsoft-com:vml" xmlns:wp14="http://schemas.microsoft.com/office/word/2010/wordprocessingDrawing" xmlns:wp="http://schemas.openxmlformats.org/drawingml/2006/wordprocessingDrawing" xmlns:w10="urn:schemas-microsoft-com:office:word" xmlns:w="http://schemas.openxmlformats.org/wordprocessingml/2006/main" xmlns:w14="http://schemas.microsoft.com/office/word/2010/wordml" xmlns:w15="http://schemas.microsoft.com/office/word/2012/wordml" xmlns:w16cex="http://schemas.microsoft.com/office/word/2018/wordml/cex" xmlns:w16cid="http://schemas.microsoft.com/office/word/2016/wordml/cid" xmlns:w16="http://schemas.microsoft.com/office/word/2018/wordml" xmlns:w16du="http://schemas.microsoft.com/office/word/2023/wordml/word16du" xmlns:w16sdtdh="http://schemas.microsoft.com/office/word/2020/wordml/sdtdatahash" xmlns:w16sdtfl="http://schemas.microsoft.com/office/word/2024/wordml/sdtformatlock" xmlns:w16se="http://schemas.microsoft.com/office/word/2015/wordml/symex" xmlns:wpg="http://schemas.microsoft.com/office/word/2010/wordprocessingGroup" xmlns:wpi="http://schemas.microsoft.com/office/word/2010/wordprocessingInk" xmlns:wne="http://schemas.microsoft.com/office/word/2006/wordml" xmlns:wps="http://schemas.microsoft.com/office/word/2010/wordprocessingShape" mc:Ignorable="w14 w15 w16se w16cid w16 w16cex w16sdtdh w16sdtfl w16du wp14">
   <w:abstractNum w:abstractNumId="0" w15:restartNumberingAfterBreak="0">
+    <w:nsid w:val="010A10FA"/>
+    <w:multiLevelType w:val="multilevel"/>
+    <w:tmpl w:val="ED9AC122"/>
+    <w:lvl w:ilvl="0">
+      <w:start w:val="1"/>
+      <w:numFmt w:val="bullet"/>
+      <w:lvlText w:val=""/>
+      <w:lvlJc w:val="left"/>
+      <w:pPr>
+        <w:tabs>
+          <w:tab w:val="num" w:pos="720"/>
+        </w:tabs>
+        <w:ind w:left="720" w:hanging="360"/>
+      </w:pPr>
+      <w:rPr>
+        <w:rFonts w:ascii="Symbol" w:hAnsi="Symbol" w:hint="default"/>
+        <w:sz w:val="20"/>
+      </w:rPr>
+    </w:lvl>
+    <w:lvl w:ilvl="1" w:tentative="1">
+      <w:start w:val="1"/>
+      <w:numFmt w:val="bullet"/>
+      <w:lvlText w:val="o"/>
+      <w:lvlJc w:val="left"/>
+      <w:pPr>
+        <w:tabs>
+          <w:tab w:val="num" w:pos="1440"/>
+        </w:tabs>
+        <w:ind w:left="1440" w:hanging="360"/>
+      </w:pPr>
+      <w:rPr>
+        <w:rFonts w:ascii="Courier New" w:hAnsi="Courier New" w:hint="default"/>
+        <w:sz w:val="20"/>
+      </w:rPr>
+    </w:lvl>
+    <w:lvl w:ilvl="2" w:tentative="1">
+      <w:start w:val="1"/>
+      <w:numFmt w:val="bullet"/>
+      <w:lvlText w:val=""/>
+      <w:lvlJc w:val="left"/>
+      <w:pPr>
+        <w:tabs>
+          <w:tab w:val="num" w:pos="2160"/>
+        </w:tabs>
+        <w:ind w:left="2160" w:hanging="360"/>
+      </w:pPr>
+      <w:rPr>
+        <w:rFonts w:ascii="Wingdings" w:hAnsi="Wingdings" w:hint="default"/>
+        <w:sz w:val="20"/>
+      </w:rPr>
+    </w:lvl>
+    <w:lvl w:ilvl="3" w:tentative="1">
+      <w:start w:val="1"/>
+      <w:numFmt w:val="bullet"/>
+      <w:lvlText w:val=""/>
+      <w:lvlJc w:val="left"/>
+      <w:pPr>
+        <w:tabs>
+          <w:tab w:val="num" w:pos="2880"/>
+        </w:tabs>
+        <w:ind w:left="2880" w:hanging="360"/>
+      </w:pPr>
+      <w:rPr>
+        <w:rFonts w:ascii="Wingdings" w:hAnsi="Wingdings" w:hint="default"/>
+        <w:sz w:val="20"/>
+      </w:rPr>
+    </w:lvl>
+    <w:lvl w:ilvl="4" w:tentative="1">
+      <w:start w:val="1"/>
+      <w:numFmt w:val="bullet"/>
+      <w:lvlText w:val=""/>
+      <w:lvlJc w:val="left"/>
+      <w:pPr>
+        <w:tabs>
+          <w:tab w:val="num" w:pos="3600"/>
+        </w:tabs>
+        <w:ind w:left="3600" w:hanging="360"/>
+      </w:pPr>
+      <w:rPr>
+        <w:rFonts w:ascii="Wingdings" w:hAnsi="Wingdings" w:hint="default"/>
+        <w:sz w:val="20"/>
+      </w:rPr>
+    </w:lvl>
+    <w:lvl w:ilvl="5" w:tentative="1">
+      <w:start w:val="1"/>
+      <w:numFmt w:val="bullet"/>
+      <w:lvlText w:val=""/>
+      <w:lvlJc w:val="left"/>
+      <w:pPr>
+        <w:tabs>
+          <w:tab w:val="num" w:pos="4320"/>
+        </w:tabs>
+        <w:ind w:left="4320" w:hanging="360"/>
+      </w:pPr>
+      <w:rPr>
+        <w:rFonts w:ascii="Wingdings" w:hAnsi="Wingdings" w:hint="default"/>
+        <w:sz w:val="20"/>
+      </w:rPr>
+    </w:lvl>
+    <w:lvl w:ilvl="6" w:tentative="1">
+      <w:start w:val="1"/>
+      <w:numFmt w:val="bullet"/>
+      <w:lvlText w:val=""/>
+      <w:lvlJc w:val="left"/>
+      <w:pPr>
+        <w:tabs>
+          <w:tab w:val="num" w:pos="5040"/>
+        </w:tabs>
+        <w:ind w:left="5040" w:hanging="360"/>
+      </w:pPr>
+      <w:rPr>
+        <w:rFonts w:ascii="Wingdings" w:hAnsi="Wingdings" w:hint="default"/>
+        <w:sz w:val="20"/>
+      </w:rPr>
+    </w:lvl>
+    <w:lvl w:ilvl="7" w:tentative="1">
+      <w:start w:val="1"/>
+      <w:numFmt w:val="bullet"/>
+      <w:lvlText w:val=""/>
+      <w:lvlJc w:val="left"/>
+      <w:pPr>
+        <w:tabs>
+          <w:tab w:val="num" w:pos="5760"/>
+        </w:tabs>
+        <w:ind w:left="5760" w:hanging="360"/>
+      </w:pPr>
+      <w:rPr>
+        <w:rFonts w:ascii="Wingdings" w:hAnsi="Wingdings" w:hint="default"/>
+        <w:sz w:val="20"/>
+      </w:rPr>
+    </w:lvl>
+    <w:lvl w:ilvl="8" w:tentative="1">
+      <w:start w:val="1"/>
+      <w:numFmt w:val="bullet"/>
+      <w:lvlText w:val=""/>
+      <w:lvlJc w:val="left"/>
+      <w:pPr>
+        <w:tabs>
+          <w:tab w:val="num" w:pos="6480"/>
+        </w:tabs>
+        <w:ind w:left="6480" w:hanging="360"/>
+      </w:pPr>
+      <w:rPr>
+        <w:rFonts w:ascii="Wingdings" w:hAnsi="Wingdings" w:hint="default"/>
+        <w:sz w:val="20"/>
+      </w:rPr>
+    </w:lvl>
+  </w:abstractNum>
+  <w:abstractNum w:abstractNumId="1" w15:restartNumberingAfterBreak="0">
+    <w:nsid w:val="027452E3"/>
+    <w:multiLevelType w:val="multilevel"/>
+    <w:tmpl w:val="3B466C42"/>
+    <w:lvl w:ilvl="0">
+      <w:start w:val="1"/>
+      <w:numFmt w:val="bullet"/>
+      <w:lvlText w:val=""/>
+      <w:lvlJc w:val="left"/>
+      <w:pPr>
+        <w:tabs>
+          <w:tab w:val="num" w:pos="720"/>
+        </w:tabs>
+        <w:ind w:left="720" w:hanging="360"/>
+      </w:pPr>
+      <w:rPr>
+        <w:rFonts w:ascii="Symbol" w:hAnsi="Symbol" w:hint="default"/>
+        <w:sz w:val="20"/>
+      </w:rPr>
+    </w:lvl>
+    <w:lvl w:ilvl="1" w:tentative="1">
+      <w:start w:val="1"/>
+      <w:numFmt w:val="bullet"/>
+      <w:lvlText w:val="o"/>
+      <w:lvlJc w:val="left"/>
+      <w:pPr>
+        <w:tabs>
+          <w:tab w:val="num" w:pos="1440"/>
+        </w:tabs>
+        <w:ind w:left="1440" w:hanging="360"/>
+      </w:pPr>
+      <w:rPr>
+        <w:rFonts w:ascii="Courier New" w:hAnsi="Courier New" w:hint="default"/>
+        <w:sz w:val="20"/>
+      </w:rPr>
+    </w:lvl>
+    <w:lvl w:ilvl="2" w:tentative="1">
+      <w:start w:val="1"/>
+      <w:numFmt w:val="bullet"/>
+      <w:lvlText w:val=""/>
+      <w:lvlJc w:val="left"/>
+      <w:pPr>
+        <w:tabs>
+          <w:tab w:val="num" w:pos="2160"/>
+        </w:tabs>
+        <w:ind w:left="2160" w:hanging="360"/>
+      </w:pPr>
+      <w:rPr>
+        <w:rFonts w:ascii="Wingdings" w:hAnsi="Wingdings" w:hint="default"/>
+        <w:sz w:val="20"/>
+      </w:rPr>
+    </w:lvl>
+    <w:lvl w:ilvl="3" w:tentative="1">
+      <w:start w:val="1"/>
+      <w:numFmt w:val="bullet"/>
+      <w:lvlText w:val=""/>
+      <w:lvlJc w:val="left"/>
+      <w:pPr>
+        <w:tabs>
+          <w:tab w:val="num" w:pos="2880"/>
+        </w:tabs>
+        <w:ind w:left="2880" w:hanging="360"/>
+      </w:pPr>
+      <w:rPr>
+        <w:rFonts w:ascii="Wingdings" w:hAnsi="Wingdings" w:hint="default"/>
+        <w:sz w:val="20"/>
+      </w:rPr>
+    </w:lvl>
+    <w:lvl w:ilvl="4" w:tentative="1">
+      <w:start w:val="1"/>
+      <w:numFmt w:val="bullet"/>
+      <w:lvlText w:val=""/>
+      <w:lvlJc w:val="left"/>
+      <w:pPr>
+        <w:tabs>
+          <w:tab w:val="num" w:pos="3600"/>
+        </w:tabs>
+        <w:ind w:left="3600" w:hanging="360"/>
+      </w:pPr>
+      <w:rPr>
+        <w:rFonts w:ascii="Wingdings" w:hAnsi="Wingdings" w:hint="default"/>
+        <w:sz w:val="20"/>
+      </w:rPr>
+    </w:lvl>
+    <w:lvl w:ilvl="5" w:tentative="1">
+      <w:start w:val="1"/>
+      <w:numFmt w:val="bullet"/>
+      <w:lvlText w:val=""/>
+      <w:lvlJc w:val="left"/>
+      <w:pPr>
+        <w:tabs>
+          <w:tab w:val="num" w:pos="4320"/>
+        </w:tabs>
+        <w:ind w:left="4320" w:hanging="360"/>
+      </w:pPr>
+      <w:rPr>
+        <w:rFonts w:ascii="Wingdings" w:hAnsi="Wingdings" w:hint="default"/>
+        <w:sz w:val="20"/>
+      </w:rPr>
+    </w:lvl>
+    <w:lvl w:ilvl="6" w:tentative="1">
+      <w:start w:val="1"/>
+      <w:numFmt w:val="bullet"/>
+      <w:lvlText w:val=""/>
+      <w:lvlJc w:val="left"/>
+      <w:pPr>
+        <w:tabs>
+          <w:tab w:val="num" w:pos="5040"/>
+        </w:tabs>
+        <w:ind w:left="5040" w:hanging="360"/>
+      </w:pPr>
+      <w:rPr>
+        <w:rFonts w:ascii="Wingdings" w:hAnsi="Wingdings" w:hint="default"/>
+        <w:sz w:val="20"/>
+      </w:rPr>
+    </w:lvl>
+    <w:lvl w:ilvl="7" w:tentative="1">
+      <w:start w:val="1"/>
+      <w:numFmt w:val="bullet"/>
+      <w:lvlText w:val=""/>
+      <w:lvlJc w:val="left"/>
+      <w:pPr>
+        <w:tabs>
+          <w:tab w:val="num" w:pos="5760"/>
+        </w:tabs>
+        <w:ind w:left="5760" w:hanging="360"/>
+      </w:pPr>
+      <w:rPr>
+        <w:rFonts w:ascii="Wingdings" w:hAnsi="Wingdings" w:hint="default"/>
+        <w:sz w:val="20"/>
+      </w:rPr>
+    </w:lvl>
+    <w:lvl w:ilvl="8" w:tentative="1">
+      <w:start w:val="1"/>
+      <w:numFmt w:val="bullet"/>
+      <w:lvlText w:val=""/>
+      <w:lvlJc w:val="left"/>
+      <w:pPr>
+        <w:tabs>
+          <w:tab w:val="num" w:pos="6480"/>
+        </w:tabs>
+        <w:ind w:left="6480" w:hanging="360"/>
+      </w:pPr>
+      <w:rPr>
+        <w:rFonts w:ascii="Wingdings" w:hAnsi="Wingdings" w:hint="default"/>
+        <w:sz w:val="20"/>
+      </w:rPr>
+    </w:lvl>
+  </w:abstractNum>
+  <w:abstractNum w:abstractNumId="2" w15:restartNumberingAfterBreak="0">
     <w:nsid w:val="03AA3F69"/>
     <w:multiLevelType w:val="multilevel"/>
     <w:tmpl w:val="E654CE16"/>
@@ -20169,7 +22214,7 @@
       </w:rPr>
     </w:lvl>
   </w:abstractNum>
-  <w:abstractNum w:abstractNumId="1" w15:restartNumberingAfterBreak="0">
+  <w:abstractNum w:abstractNumId="3" w15:restartNumberingAfterBreak="0">
     <w:nsid w:val="0B503B2C"/>
     <w:multiLevelType w:val="hybridMultilevel"/>
     <w:tmpl w:val="75B2B7E8"/>
@@ -20282,7 +22327,7 @@
       </w:rPr>
     </w:lvl>
   </w:abstractNum>
-  <w:abstractNum w:abstractNumId="2" w15:restartNumberingAfterBreak="0">
+  <w:abstractNum w:abstractNumId="4" w15:restartNumberingAfterBreak="0">
     <w:nsid w:val="0C327DFE"/>
     <w:multiLevelType w:val="hybridMultilevel"/>
     <w:tmpl w:val="B5B46D66"/>
@@ -20395,7 +22440,7 @@
       </w:rPr>
     </w:lvl>
   </w:abstractNum>
-  <w:abstractNum w:abstractNumId="3" w15:restartNumberingAfterBreak="0">
+  <w:abstractNum w:abstractNumId="5" w15:restartNumberingAfterBreak="0">
     <w:nsid w:val="1011109E"/>
     <w:multiLevelType w:val="multilevel"/>
     <w:tmpl w:val="6D6C43E6"/>
@@ -20544,7 +22589,7 @@
       </w:rPr>
     </w:lvl>
   </w:abstractNum>
-  <w:abstractNum w:abstractNumId="4" w15:restartNumberingAfterBreak="0">
+  <w:abstractNum w:abstractNumId="6" w15:restartNumberingAfterBreak="0">
     <w:nsid w:val="12F331C9"/>
     <w:multiLevelType w:val="hybridMultilevel"/>
     <w:tmpl w:val="C610CCA2"/>
@@ -20657,7 +22702,7 @@
       </w:rPr>
     </w:lvl>
   </w:abstractNum>
-  <w:abstractNum w:abstractNumId="5" w15:restartNumberingAfterBreak="0">
+  <w:abstractNum w:abstractNumId="7" w15:restartNumberingAfterBreak="0">
     <w:nsid w:val="168A51D9"/>
     <w:multiLevelType w:val="multilevel"/>
     <w:tmpl w:val="7B3C48C6"/>
@@ -20806,7 +22851,7 @@
       </w:rPr>
     </w:lvl>
   </w:abstractNum>
-  <w:abstractNum w:abstractNumId="6" w15:restartNumberingAfterBreak="0">
+  <w:abstractNum w:abstractNumId="8" w15:restartNumberingAfterBreak="0">
     <w:nsid w:val="17246321"/>
     <w:multiLevelType w:val="multilevel"/>
     <w:tmpl w:val="7EDEB212"/>
@@ -20955,7 +23000,156 @@
       </w:rPr>
     </w:lvl>
   </w:abstractNum>
-  <w:abstractNum w:abstractNumId="7" w15:restartNumberingAfterBreak="0">
+  <w:abstractNum w:abstractNumId="9" w15:restartNumberingAfterBreak="0">
+    <w:nsid w:val="1C8F5785"/>
+    <w:multiLevelType w:val="multilevel"/>
+    <w:tmpl w:val="979A8C14"/>
+    <w:lvl w:ilvl="0">
+      <w:start w:val="1"/>
+      <w:numFmt w:val="bullet"/>
+      <w:lvlText w:val=""/>
+      <w:lvlJc w:val="left"/>
+      <w:pPr>
+        <w:tabs>
+          <w:tab w:val="num" w:pos="720"/>
+        </w:tabs>
+        <w:ind w:left="720" w:hanging="360"/>
+      </w:pPr>
+      <w:rPr>
+        <w:rFonts w:ascii="Symbol" w:hAnsi="Symbol" w:hint="default"/>
+        <w:sz w:val="20"/>
+      </w:rPr>
+    </w:lvl>
+    <w:lvl w:ilvl="1" w:tentative="1">
+      <w:start w:val="1"/>
+      <w:numFmt w:val="bullet"/>
+      <w:lvlText w:val="o"/>
+      <w:lvlJc w:val="left"/>
+      <w:pPr>
+        <w:tabs>
+          <w:tab w:val="num" w:pos="1440"/>
+        </w:tabs>
+        <w:ind w:left="1440" w:hanging="360"/>
+      </w:pPr>
+      <w:rPr>
+        <w:rFonts w:ascii="Courier New" w:hAnsi="Courier New" w:hint="default"/>
+        <w:sz w:val="20"/>
+      </w:rPr>
+    </w:lvl>
+    <w:lvl w:ilvl="2" w:tentative="1">
+      <w:start w:val="1"/>
+      <w:numFmt w:val="bullet"/>
+      <w:lvlText w:val=""/>
+      <w:lvlJc w:val="left"/>
+      <w:pPr>
+        <w:tabs>
+          <w:tab w:val="num" w:pos="2160"/>
+        </w:tabs>
+        <w:ind w:left="2160" w:hanging="360"/>
+      </w:pPr>
+      <w:rPr>
+        <w:rFonts w:ascii="Wingdings" w:hAnsi="Wingdings" w:hint="default"/>
+        <w:sz w:val="20"/>
+      </w:rPr>
+    </w:lvl>
+    <w:lvl w:ilvl="3" w:tentative="1">
+      <w:start w:val="1"/>
+      <w:numFmt w:val="bullet"/>
+      <w:lvlText w:val=""/>
+      <w:lvlJc w:val="left"/>
+      <w:pPr>
+        <w:tabs>
+          <w:tab w:val="num" w:pos="2880"/>
+        </w:tabs>
+        <w:ind w:left="2880" w:hanging="360"/>
+      </w:pPr>
+      <w:rPr>
+        <w:rFonts w:ascii="Wingdings" w:hAnsi="Wingdings" w:hint="default"/>
+        <w:sz w:val="20"/>
+      </w:rPr>
+    </w:lvl>
+    <w:lvl w:ilvl="4" w:tentative="1">
+      <w:start w:val="1"/>
+      <w:numFmt w:val="bullet"/>
+      <w:lvlText w:val=""/>
+      <w:lvlJc w:val="left"/>
+      <w:pPr>
+        <w:tabs>
+          <w:tab w:val="num" w:pos="3600"/>
+        </w:tabs>
+        <w:ind w:left="3600" w:hanging="360"/>
+      </w:pPr>
+      <w:rPr>
+        <w:rFonts w:ascii="Wingdings" w:hAnsi="Wingdings" w:hint="default"/>
+        <w:sz w:val="20"/>
+      </w:rPr>
+    </w:lvl>
+    <w:lvl w:ilvl="5" w:tentative="1">
+      <w:start w:val="1"/>
+      <w:numFmt w:val="bullet"/>
+      <w:lvlText w:val=""/>
+      <w:lvlJc w:val="left"/>
+      <w:pPr>
+        <w:tabs>
+          <w:tab w:val="num" w:pos="4320"/>
+        </w:tabs>
+        <w:ind w:left="4320" w:hanging="360"/>
+      </w:pPr>
+      <w:rPr>
+        <w:rFonts w:ascii="Wingdings" w:hAnsi="Wingdings" w:hint="default"/>
+        <w:sz w:val="20"/>
+      </w:rPr>
+    </w:lvl>
+    <w:lvl w:ilvl="6" w:tentative="1">
+      <w:start w:val="1"/>
+      <w:numFmt w:val="bullet"/>
+      <w:lvlText w:val=""/>
+      <w:lvlJc w:val="left"/>
+      <w:pPr>
+        <w:tabs>
+          <w:tab w:val="num" w:pos="5040"/>
+        </w:tabs>
+        <w:ind w:left="5040" w:hanging="360"/>
+      </w:pPr>
+      <w:rPr>
+        <w:rFonts w:ascii="Wingdings" w:hAnsi="Wingdings" w:hint="default"/>
+        <w:sz w:val="20"/>
+      </w:rPr>
+    </w:lvl>
+    <w:lvl w:ilvl="7" w:tentative="1">
+      <w:start w:val="1"/>
+      <w:numFmt w:val="bullet"/>
+      <w:lvlText w:val=""/>
+      <w:lvlJc w:val="left"/>
+      <w:pPr>
+        <w:tabs>
+          <w:tab w:val="num" w:pos="5760"/>
+        </w:tabs>
+        <w:ind w:left="5760" w:hanging="360"/>
+      </w:pPr>
+      <w:rPr>
+        <w:rFonts w:ascii="Wingdings" w:hAnsi="Wingdings" w:hint="default"/>
+        <w:sz w:val="20"/>
+      </w:rPr>
+    </w:lvl>
+    <w:lvl w:ilvl="8" w:tentative="1">
+      <w:start w:val="1"/>
+      <w:numFmt w:val="bullet"/>
+      <w:lvlText w:val=""/>
+      <w:lvlJc w:val="left"/>
+      <w:pPr>
+        <w:tabs>
+          <w:tab w:val="num" w:pos="6480"/>
+        </w:tabs>
+        <w:ind w:left="6480" w:hanging="360"/>
+      </w:pPr>
+      <w:rPr>
+        <w:rFonts w:ascii="Wingdings" w:hAnsi="Wingdings" w:hint="default"/>
+        <w:sz w:val="20"/>
+      </w:rPr>
+    </w:lvl>
+  </w:abstractNum>
+  <w:abstractNum w:abstractNumId="10" w15:restartNumberingAfterBreak="0">
     <w:nsid w:val="1FF531D0"/>
     <w:multiLevelType w:val="multilevel"/>
     <w:tmpl w:val="7FF8B9F8"/>
@@ -21104,7 +23298,7 @@
       </w:rPr>
     </w:lvl>
   </w:abstractNum>
-  <w:abstractNum w:abstractNumId="8" w15:restartNumberingAfterBreak="0">
+  <w:abstractNum w:abstractNumId="11" w15:restartNumberingAfterBreak="0">
     <w:nsid w:val="200F1611"/>
     <w:multiLevelType w:val="multilevel"/>
     <w:tmpl w:val="57E0AC44"/>
@@ -21253,7 +23447,7 @@
       </w:rPr>
     </w:lvl>
   </w:abstractNum>
-  <w:abstractNum w:abstractNumId="9" w15:restartNumberingAfterBreak="0">
+  <w:abstractNum w:abstractNumId="12" w15:restartNumberingAfterBreak="0">
     <w:nsid w:val="203E1A21"/>
     <w:multiLevelType w:val="multilevel"/>
     <w:tmpl w:val="143A7BE4"/>
@@ -21402,7 +23596,7 @@
       </w:rPr>
     </w:lvl>
   </w:abstractNum>
-  <w:abstractNum w:abstractNumId="10" w15:restartNumberingAfterBreak="0">
+  <w:abstractNum w:abstractNumId="13" w15:restartNumberingAfterBreak="0">
     <w:nsid w:val="2146214C"/>
     <w:multiLevelType w:val="hybridMultilevel"/>
     <w:tmpl w:val="2B282506"/>
@@ -21515,7 +23709,7 @@
       </w:rPr>
     </w:lvl>
   </w:abstractNum>
-  <w:abstractNum w:abstractNumId="11" w15:restartNumberingAfterBreak="0">
+  <w:abstractNum w:abstractNumId="14" w15:restartNumberingAfterBreak="0">
     <w:nsid w:val="23471214"/>
     <w:multiLevelType w:val="multilevel"/>
     <w:tmpl w:val="6F360A44"/>
@@ -21664,7 +23858,7 @@
       </w:rPr>
     </w:lvl>
   </w:abstractNum>
-  <w:abstractNum w:abstractNumId="12" w15:restartNumberingAfterBreak="0">
+  <w:abstractNum w:abstractNumId="15" w15:restartNumberingAfterBreak="0">
     <w:nsid w:val="2729128B"/>
     <w:multiLevelType w:val="multilevel"/>
     <w:tmpl w:val="00620DEE"/>
@@ -21813,7 +24007,7 @@
       </w:rPr>
     </w:lvl>
   </w:abstractNum>
-  <w:abstractNum w:abstractNumId="13" w15:restartNumberingAfterBreak="0">
+  <w:abstractNum w:abstractNumId="16" w15:restartNumberingAfterBreak="0">
     <w:nsid w:val="281C01EF"/>
     <w:multiLevelType w:val="hybridMultilevel"/>
     <w:tmpl w:val="C7CC6BC8"/>
@@ -21926,7 +24120,7 @@
       </w:rPr>
     </w:lvl>
   </w:abstractNum>
-  <w:abstractNum w:abstractNumId="14" w15:restartNumberingAfterBreak="0">
+  <w:abstractNum w:abstractNumId="17" w15:restartNumberingAfterBreak="0">
     <w:nsid w:val="28F20A3A"/>
     <w:multiLevelType w:val="multilevel"/>
     <w:tmpl w:val="26B683FA"/>
@@ -22075,7 +24269,7 @@
       </w:rPr>
     </w:lvl>
   </w:abstractNum>
-  <w:abstractNum w:abstractNumId="15" w15:restartNumberingAfterBreak="0">
+  <w:abstractNum w:abstractNumId="18" w15:restartNumberingAfterBreak="0">
     <w:nsid w:val="28F45D45"/>
     <w:multiLevelType w:val="multilevel"/>
     <w:tmpl w:val="CD98E1FC"/>
@@ -22224,7 +24418,7 @@
       </w:rPr>
     </w:lvl>
   </w:abstractNum>
-  <w:abstractNum w:abstractNumId="16" w15:restartNumberingAfterBreak="0">
+  <w:abstractNum w:abstractNumId="19" w15:restartNumberingAfterBreak="0">
     <w:nsid w:val="299F645E"/>
     <w:multiLevelType w:val="hybridMultilevel"/>
     <w:tmpl w:val="9AD8E14E"/>
@@ -22337,7 +24531,7 @@
       </w:rPr>
     </w:lvl>
   </w:abstractNum>
-  <w:abstractNum w:abstractNumId="17" w15:restartNumberingAfterBreak="0">
+  <w:abstractNum w:abstractNumId="20" w15:restartNumberingAfterBreak="0">
     <w:nsid w:val="2A12255A"/>
     <w:multiLevelType w:val="multilevel"/>
     <w:tmpl w:val="3C469322"/>
@@ -22486,7 +24680,7 @@
       </w:rPr>
     </w:lvl>
   </w:abstractNum>
-  <w:abstractNum w:abstractNumId="18" w15:restartNumberingAfterBreak="0">
+  <w:abstractNum w:abstractNumId="21" w15:restartNumberingAfterBreak="0">
     <w:nsid w:val="2D734E3E"/>
     <w:multiLevelType w:val="hybridMultilevel"/>
     <w:tmpl w:val="B6FEC096"/>
@@ -22599,7 +24793,156 @@
       </w:rPr>
     </w:lvl>
   </w:abstractNum>
-  <w:abstractNum w:abstractNumId="19" w15:restartNumberingAfterBreak="0">
+  <w:abstractNum w:abstractNumId="22" w15:restartNumberingAfterBreak="0">
+    <w:nsid w:val="2DD9174E"/>
+    <w:multiLevelType w:val="multilevel"/>
+    <w:tmpl w:val="6700E206"/>
+    <w:lvl w:ilvl="0">
+      <w:start w:val="1"/>
+      <w:numFmt w:val="bullet"/>
+      <w:lvlText w:val=""/>
+      <w:lvlJc w:val="left"/>
+      <w:pPr>
+        <w:tabs>
+          <w:tab w:val="num" w:pos="720"/>
+        </w:tabs>
+        <w:ind w:left="720" w:hanging="360"/>
+      </w:pPr>
+      <w:rPr>
+        <w:rFonts w:ascii="Symbol" w:hAnsi="Symbol" w:hint="default"/>
+        <w:sz w:val="20"/>
+      </w:rPr>
+    </w:lvl>
+    <w:lvl w:ilvl="1" w:tentative="1">
+      <w:start w:val="1"/>
+      <w:numFmt w:val="bullet"/>
+      <w:lvlText w:val="o"/>
+      <w:lvlJc w:val="left"/>
+      <w:pPr>
+        <w:tabs>
+          <w:tab w:val="num" w:pos="1440"/>
+        </w:tabs>
+        <w:ind w:left="1440" w:hanging="360"/>
+      </w:pPr>
+      <w:rPr>
+        <w:rFonts w:ascii="Courier New" w:hAnsi="Courier New" w:hint="default"/>
+        <w:sz w:val="20"/>
+      </w:rPr>
+    </w:lvl>
+    <w:lvl w:ilvl="2" w:tentative="1">
+      <w:start w:val="1"/>
+      <w:numFmt w:val="bullet"/>
+      <w:lvlText w:val=""/>
+      <w:lvlJc w:val="left"/>
+      <w:pPr>
+        <w:tabs>
+          <w:tab w:val="num" w:pos="2160"/>
+        </w:tabs>
+        <w:ind w:left="2160" w:hanging="360"/>
+      </w:pPr>
+      <w:rPr>
+        <w:rFonts w:ascii="Wingdings" w:hAnsi="Wingdings" w:hint="default"/>
+        <w:sz w:val="20"/>
+      </w:rPr>
+    </w:lvl>
+    <w:lvl w:ilvl="3" w:tentative="1">
+      <w:start w:val="1"/>
+      <w:numFmt w:val="bullet"/>
+      <w:lvlText w:val=""/>
+      <w:lvlJc w:val="left"/>
+      <w:pPr>
+        <w:tabs>
+          <w:tab w:val="num" w:pos="2880"/>
+        </w:tabs>
+        <w:ind w:left="2880" w:hanging="360"/>
+      </w:pPr>
+      <w:rPr>
+        <w:rFonts w:ascii="Wingdings" w:hAnsi="Wingdings" w:hint="default"/>
+        <w:sz w:val="20"/>
+      </w:rPr>
+    </w:lvl>
+    <w:lvl w:ilvl="4" w:tentative="1">
+      <w:start w:val="1"/>
+      <w:numFmt w:val="bullet"/>
+      <w:lvlText w:val=""/>
+      <w:lvlJc w:val="left"/>
+      <w:pPr>
+        <w:tabs>
+          <w:tab w:val="num" w:pos="3600"/>
+        </w:tabs>
+        <w:ind w:left="3600" w:hanging="360"/>
+      </w:pPr>
+      <w:rPr>
+        <w:rFonts w:ascii="Wingdings" w:hAnsi="Wingdings" w:hint="default"/>
+        <w:sz w:val="20"/>
+      </w:rPr>
+    </w:lvl>
+    <w:lvl w:ilvl="5" w:tentative="1">
+      <w:start w:val="1"/>
+      <w:numFmt w:val="bullet"/>
+      <w:lvlText w:val=""/>
+      <w:lvlJc w:val="left"/>
+      <w:pPr>
+        <w:tabs>
+          <w:tab w:val="num" w:pos="4320"/>
+        </w:tabs>
+        <w:ind w:left="4320" w:hanging="360"/>
+      </w:pPr>
+      <w:rPr>
+        <w:rFonts w:ascii="Wingdings" w:hAnsi="Wingdings" w:hint="default"/>
+        <w:sz w:val="20"/>
+      </w:rPr>
+    </w:lvl>
+    <w:lvl w:ilvl="6" w:tentative="1">
+      <w:start w:val="1"/>
+      <w:numFmt w:val="bullet"/>
+      <w:lvlText w:val=""/>
+      <w:lvlJc w:val="left"/>
+      <w:pPr>
+        <w:tabs>
+          <w:tab w:val="num" w:pos="5040"/>
+        </w:tabs>
+        <w:ind w:left="5040" w:hanging="360"/>
+      </w:pPr>
+      <w:rPr>
+        <w:rFonts w:ascii="Wingdings" w:hAnsi="Wingdings" w:hint="default"/>
+        <w:sz w:val="20"/>
+      </w:rPr>
+    </w:lvl>
+    <w:lvl w:ilvl="7" w:tentative="1">
+      <w:start w:val="1"/>
+      <w:numFmt w:val="bullet"/>
+      <w:lvlText w:val=""/>
+      <w:lvlJc w:val="left"/>
+      <w:pPr>
+        <w:tabs>
+          <w:tab w:val="num" w:pos="5760"/>
+        </w:tabs>
+        <w:ind w:left="5760" w:hanging="360"/>
+      </w:pPr>
+      <w:rPr>
+        <w:rFonts w:ascii="Wingdings" w:hAnsi="Wingdings" w:hint="default"/>
+        <w:sz w:val="20"/>
+      </w:rPr>
+    </w:lvl>
+    <w:lvl w:ilvl="8" w:tentative="1">
+      <w:start w:val="1"/>
+      <w:numFmt w:val="bullet"/>
+      <w:lvlText w:val=""/>
+      <w:lvlJc w:val="left"/>
+      <w:pPr>
+        <w:tabs>
+          <w:tab w:val="num" w:pos="6480"/>
+        </w:tabs>
+        <w:ind w:left="6480" w:hanging="360"/>
+      </w:pPr>
+      <w:rPr>
+        <w:rFonts w:ascii="Wingdings" w:hAnsi="Wingdings" w:hint="default"/>
+        <w:sz w:val="20"/>
+      </w:rPr>
+    </w:lvl>
+  </w:abstractNum>
+  <w:abstractNum w:abstractNumId="23" w15:restartNumberingAfterBreak="0">
     <w:nsid w:val="2E3C6919"/>
     <w:multiLevelType w:val="multilevel"/>
     <w:tmpl w:val="8460F8F0"/>
@@ -22748,7 +25091,156 @@
       </w:rPr>
     </w:lvl>
   </w:abstractNum>
-  <w:abstractNum w:abstractNumId="20" w15:restartNumberingAfterBreak="0">
+  <w:abstractNum w:abstractNumId="24" w15:restartNumberingAfterBreak="0">
+    <w:nsid w:val="2E7D2B39"/>
+    <w:multiLevelType w:val="multilevel"/>
+    <w:tmpl w:val="CC22D5EE"/>
+    <w:lvl w:ilvl="0">
+      <w:start w:val="1"/>
+      <w:numFmt w:val="bullet"/>
+      <w:lvlText w:val=""/>
+      <w:lvlJc w:val="left"/>
+      <w:pPr>
+        <w:tabs>
+          <w:tab w:val="num" w:pos="720"/>
+        </w:tabs>
+        <w:ind w:left="720" w:hanging="360"/>
+      </w:pPr>
+      <w:rPr>
+        <w:rFonts w:ascii="Symbol" w:hAnsi="Symbol" w:hint="default"/>
+        <w:sz w:val="20"/>
+      </w:rPr>
+    </w:lvl>
+    <w:lvl w:ilvl="1" w:tentative="1">
+      <w:start w:val="1"/>
+      <w:numFmt w:val="bullet"/>
+      <w:lvlText w:val="o"/>
+      <w:lvlJc w:val="left"/>
+      <w:pPr>
+        <w:tabs>
+          <w:tab w:val="num" w:pos="1440"/>
+        </w:tabs>
+        <w:ind w:left="1440" w:hanging="360"/>
+      </w:pPr>
+      <w:rPr>
+        <w:rFonts w:ascii="Courier New" w:hAnsi="Courier New" w:hint="default"/>
+        <w:sz w:val="20"/>
+      </w:rPr>
+    </w:lvl>
+    <w:lvl w:ilvl="2" w:tentative="1">
+      <w:start w:val="1"/>
+      <w:numFmt w:val="bullet"/>
+      <w:lvlText w:val=""/>
+      <w:lvlJc w:val="left"/>
+      <w:pPr>
+        <w:tabs>
+          <w:tab w:val="num" w:pos="2160"/>
+        </w:tabs>
+        <w:ind w:left="2160" w:hanging="360"/>
+      </w:pPr>
+      <w:rPr>
+        <w:rFonts w:ascii="Wingdings" w:hAnsi="Wingdings" w:hint="default"/>
+        <w:sz w:val="20"/>
+      </w:rPr>
+    </w:lvl>
+    <w:lvl w:ilvl="3" w:tentative="1">
+      <w:start w:val="1"/>
+      <w:numFmt w:val="bullet"/>
+      <w:lvlText w:val=""/>
+      <w:lvlJc w:val="left"/>
+      <w:pPr>
+        <w:tabs>
+          <w:tab w:val="num" w:pos="2880"/>
+        </w:tabs>
+        <w:ind w:left="2880" w:hanging="360"/>
+      </w:pPr>
+      <w:rPr>
+        <w:rFonts w:ascii="Wingdings" w:hAnsi="Wingdings" w:hint="default"/>
+        <w:sz w:val="20"/>
+      </w:rPr>
+    </w:lvl>
+    <w:lvl w:ilvl="4" w:tentative="1">
+      <w:start w:val="1"/>
+      <w:numFmt w:val="bullet"/>
+      <w:lvlText w:val=""/>
+      <w:lvlJc w:val="left"/>
+      <w:pPr>
+        <w:tabs>
+          <w:tab w:val="num" w:pos="3600"/>
+        </w:tabs>
+        <w:ind w:left="3600" w:hanging="360"/>
+      </w:pPr>
+      <w:rPr>
+        <w:rFonts w:ascii="Wingdings" w:hAnsi="Wingdings" w:hint="default"/>
+        <w:sz w:val="20"/>
+      </w:rPr>
+    </w:lvl>
+    <w:lvl w:ilvl="5" w:tentative="1">
+      <w:start w:val="1"/>
+      <w:numFmt w:val="bullet"/>
+      <w:lvlText w:val=""/>
+      <w:lvlJc w:val="left"/>
+      <w:pPr>
+        <w:tabs>
+          <w:tab w:val="num" w:pos="4320"/>
+        </w:tabs>
+        <w:ind w:left="4320" w:hanging="360"/>
+      </w:pPr>
+      <w:rPr>
+        <w:rFonts w:ascii="Wingdings" w:hAnsi="Wingdings" w:hint="default"/>
+        <w:sz w:val="20"/>
+      </w:rPr>
+    </w:lvl>
+    <w:lvl w:ilvl="6" w:tentative="1">
+      <w:start w:val="1"/>
+      <w:numFmt w:val="bullet"/>
+      <w:lvlText w:val=""/>
+      <w:lvlJc w:val="left"/>
+      <w:pPr>
+        <w:tabs>
+          <w:tab w:val="num" w:pos="5040"/>
+        </w:tabs>
+        <w:ind w:left="5040" w:hanging="360"/>
+      </w:pPr>
+      <w:rPr>
+        <w:rFonts w:ascii="Wingdings" w:hAnsi="Wingdings" w:hint="default"/>
+        <w:sz w:val="20"/>
+      </w:rPr>
+    </w:lvl>
+    <w:lvl w:ilvl="7" w:tentative="1">
+      <w:start w:val="1"/>
+      <w:numFmt w:val="bullet"/>
+      <w:lvlText w:val=""/>
+      <w:lvlJc w:val="left"/>
+      <w:pPr>
+        <w:tabs>
+          <w:tab w:val="num" w:pos="5760"/>
+        </w:tabs>
+        <w:ind w:left="5760" w:hanging="360"/>
+      </w:pPr>
+      <w:rPr>
+        <w:rFonts w:ascii="Wingdings" w:hAnsi="Wingdings" w:hint="default"/>
+        <w:sz w:val="20"/>
+      </w:rPr>
+    </w:lvl>
+    <w:lvl w:ilvl="8" w:tentative="1">
+      <w:start w:val="1"/>
+      <w:numFmt w:val="bullet"/>
+      <w:lvlText w:val=""/>
+      <w:lvlJc w:val="left"/>
+      <w:pPr>
+        <w:tabs>
+          <w:tab w:val="num" w:pos="6480"/>
+        </w:tabs>
+        <w:ind w:left="6480" w:hanging="360"/>
+      </w:pPr>
+      <w:rPr>
+        <w:rFonts w:ascii="Wingdings" w:hAnsi="Wingdings" w:hint="default"/>
+        <w:sz w:val="20"/>
+      </w:rPr>
+    </w:lvl>
+  </w:abstractNum>
+  <w:abstractNum w:abstractNumId="25" w15:restartNumberingAfterBreak="0">
     <w:nsid w:val="2F7B3F98"/>
     <w:multiLevelType w:val="multilevel"/>
     <w:tmpl w:val="FCFE5914"/>
@@ -22897,7 +25389,7 @@
       </w:rPr>
     </w:lvl>
   </w:abstractNum>
-  <w:abstractNum w:abstractNumId="21" w15:restartNumberingAfterBreak="0">
+  <w:abstractNum w:abstractNumId="26" w15:restartNumberingAfterBreak="0">
     <w:nsid w:val="303A6B1D"/>
     <w:multiLevelType w:val="hybridMultilevel"/>
     <w:tmpl w:val="13723EAE"/>
@@ -23010,7 +25502,7 @@
       </w:rPr>
     </w:lvl>
   </w:abstractNum>
-  <w:abstractNum w:abstractNumId="22" w15:restartNumberingAfterBreak="0">
+  <w:abstractNum w:abstractNumId="27" w15:restartNumberingAfterBreak="0">
     <w:nsid w:val="31BD583F"/>
     <w:multiLevelType w:val="hybridMultilevel"/>
     <w:tmpl w:val="69CAEFD8"/>
@@ -23123,7 +25615,7 @@
       </w:rPr>
     </w:lvl>
   </w:abstractNum>
-  <w:abstractNum w:abstractNumId="23" w15:restartNumberingAfterBreak="0">
+  <w:abstractNum w:abstractNumId="28" w15:restartNumberingAfterBreak="0">
     <w:nsid w:val="32DB2D4B"/>
     <w:multiLevelType w:val="multilevel"/>
     <w:tmpl w:val="8CE8143A"/>
@@ -23272,7 +25764,7 @@
       </w:rPr>
     </w:lvl>
   </w:abstractNum>
-  <w:abstractNum w:abstractNumId="24" w15:restartNumberingAfterBreak="0">
+  <w:abstractNum w:abstractNumId="29" w15:restartNumberingAfterBreak="0">
     <w:nsid w:val="33421C90"/>
     <w:multiLevelType w:val="multilevel"/>
     <w:tmpl w:val="078C0ACE"/>
@@ -23421,7 +25913,7 @@
       </w:rPr>
     </w:lvl>
   </w:abstractNum>
-  <w:abstractNum w:abstractNumId="25" w15:restartNumberingAfterBreak="0">
+  <w:abstractNum w:abstractNumId="30" w15:restartNumberingAfterBreak="0">
     <w:nsid w:val="35DE44AF"/>
     <w:multiLevelType w:val="multilevel"/>
     <w:tmpl w:val="4F30489E"/>
@@ -23570,7 +26062,7 @@
       </w:rPr>
     </w:lvl>
   </w:abstractNum>
-  <w:abstractNum w:abstractNumId="26" w15:restartNumberingAfterBreak="0">
+  <w:abstractNum w:abstractNumId="31" w15:restartNumberingAfterBreak="0">
     <w:nsid w:val="3E3C51D5"/>
     <w:multiLevelType w:val="hybridMultilevel"/>
     <w:tmpl w:val="5DEC791C"/>
@@ -23683,7 +26175,7 @@
       </w:rPr>
     </w:lvl>
   </w:abstractNum>
-  <w:abstractNum w:abstractNumId="27" w15:restartNumberingAfterBreak="0">
+  <w:abstractNum w:abstractNumId="32" w15:restartNumberingAfterBreak="0">
     <w:nsid w:val="44E97249"/>
     <w:multiLevelType w:val="multilevel"/>
     <w:tmpl w:val="6E4AA634"/>
@@ -23832,7 +26324,7 @@
       </w:rPr>
     </w:lvl>
   </w:abstractNum>
-  <w:abstractNum w:abstractNumId="28" w15:restartNumberingAfterBreak="0">
+  <w:abstractNum w:abstractNumId="33" w15:restartNumberingAfterBreak="0">
     <w:nsid w:val="467540C1"/>
     <w:multiLevelType w:val="multilevel"/>
     <w:tmpl w:val="A8067ED6"/>
@@ -23977,7 +26469,7 @@
       </w:rPr>
     </w:lvl>
   </w:abstractNum>
-  <w:abstractNum w:abstractNumId="29" w15:restartNumberingAfterBreak="0">
+  <w:abstractNum w:abstractNumId="34" w15:restartNumberingAfterBreak="0">
     <w:nsid w:val="485B208E"/>
     <w:multiLevelType w:val="multilevel"/>
     <w:tmpl w:val="455E89AC"/>
@@ -24126,7 +26618,7 @@
       </w:rPr>
     </w:lvl>
   </w:abstractNum>
-  <w:abstractNum w:abstractNumId="30" w15:restartNumberingAfterBreak="0">
+  <w:abstractNum w:abstractNumId="35" w15:restartNumberingAfterBreak="0">
     <w:nsid w:val="49A5008E"/>
     <w:multiLevelType w:val="multilevel"/>
     <w:tmpl w:val="D7A8E1BE"/>
@@ -24275,7 +26767,7 @@
       </w:rPr>
     </w:lvl>
   </w:abstractNum>
-  <w:abstractNum w:abstractNumId="31" w15:restartNumberingAfterBreak="0">
+  <w:abstractNum w:abstractNumId="36" w15:restartNumberingAfterBreak="0">
     <w:nsid w:val="4C85463B"/>
     <w:multiLevelType w:val="multilevel"/>
     <w:tmpl w:val="02F23A28"/>
@@ -24424,7 +26916,7 @@
       </w:rPr>
     </w:lvl>
   </w:abstractNum>
-  <w:abstractNum w:abstractNumId="32" w15:restartNumberingAfterBreak="0">
+  <w:abstractNum w:abstractNumId="37" w15:restartNumberingAfterBreak="0">
     <w:nsid w:val="4E1B1ECA"/>
     <w:multiLevelType w:val="multilevel"/>
     <w:tmpl w:val="C3C4CCC6"/>
@@ -24573,7 +27065,7 @@
       </w:rPr>
     </w:lvl>
   </w:abstractNum>
-  <w:abstractNum w:abstractNumId="33" w15:restartNumberingAfterBreak="0">
+  <w:abstractNum w:abstractNumId="38" w15:restartNumberingAfterBreak="0">
     <w:nsid w:val="53150BF7"/>
     <w:multiLevelType w:val="hybridMultilevel"/>
     <w:tmpl w:val="4FD058B2"/>
@@ -24686,7 +27178,7 @@
       </w:rPr>
     </w:lvl>
   </w:abstractNum>
-  <w:abstractNum w:abstractNumId="34" w15:restartNumberingAfterBreak="0">
+  <w:abstractNum w:abstractNumId="39" w15:restartNumberingAfterBreak="0">
     <w:nsid w:val="55DA5529"/>
     <w:multiLevelType w:val="multilevel"/>
     <w:tmpl w:val="8212618E"/>
@@ -24835,7 +27327,7 @@
       </w:rPr>
     </w:lvl>
   </w:abstractNum>
-  <w:abstractNum w:abstractNumId="35" w15:restartNumberingAfterBreak="0">
+  <w:abstractNum w:abstractNumId="40" w15:restartNumberingAfterBreak="0">
     <w:nsid w:val="56E84BAB"/>
     <w:multiLevelType w:val="multilevel"/>
     <w:tmpl w:val="60121038"/>
@@ -24984,7 +27476,7 @@
       </w:rPr>
     </w:lvl>
   </w:abstractNum>
-  <w:abstractNum w:abstractNumId="36" w15:restartNumberingAfterBreak="0">
+  <w:abstractNum w:abstractNumId="41" w15:restartNumberingAfterBreak="0">
     <w:nsid w:val="5F2D123E"/>
     <w:multiLevelType w:val="hybridMultilevel"/>
     <w:tmpl w:val="7A9ACF52"/>
@@ -25097,7 +27589,7 @@
       </w:rPr>
     </w:lvl>
   </w:abstractNum>
-  <w:abstractNum w:abstractNumId="37" w15:restartNumberingAfterBreak="0">
+  <w:abstractNum w:abstractNumId="42" w15:restartNumberingAfterBreak="0">
     <w:nsid w:val="60322EE8"/>
     <w:multiLevelType w:val="multilevel"/>
     <w:tmpl w:val="8112FE48"/>
@@ -25246,7 +27738,7 @@
       </w:rPr>
     </w:lvl>
   </w:abstractNum>
-  <w:abstractNum w:abstractNumId="38" w15:restartNumberingAfterBreak="0">
+  <w:abstractNum w:abstractNumId="43" w15:restartNumberingAfterBreak="0">
     <w:nsid w:val="64556410"/>
     <w:multiLevelType w:val="hybridMultilevel"/>
     <w:tmpl w:val="31BC7290"/>
@@ -25359,7 +27851,7 @@
       </w:rPr>
     </w:lvl>
   </w:abstractNum>
-  <w:abstractNum w:abstractNumId="39" w15:restartNumberingAfterBreak="0">
+  <w:abstractNum w:abstractNumId="44" w15:restartNumberingAfterBreak="0">
     <w:nsid w:val="65C50AF4"/>
     <w:multiLevelType w:val="multilevel"/>
     <w:tmpl w:val="AB3E1A20"/>
@@ -25508,7 +28000,7 @@
       </w:rPr>
     </w:lvl>
   </w:abstractNum>
-  <w:abstractNum w:abstractNumId="40" w15:restartNumberingAfterBreak="0">
+  <w:abstractNum w:abstractNumId="45" w15:restartNumberingAfterBreak="0">
     <w:nsid w:val="663E1D8A"/>
     <w:multiLevelType w:val="multilevel"/>
     <w:tmpl w:val="F888FA70"/>
@@ -25657,7 +28149,7 @@
       </w:rPr>
     </w:lvl>
   </w:abstractNum>
-  <w:abstractNum w:abstractNumId="41" w15:restartNumberingAfterBreak="0">
+  <w:abstractNum w:abstractNumId="46" w15:restartNumberingAfterBreak="0">
     <w:nsid w:val="68862DCB"/>
     <w:multiLevelType w:val="multilevel"/>
     <w:tmpl w:val="F33AC1EE"/>
@@ -25806,7 +28298,7 @@
       </w:rPr>
     </w:lvl>
   </w:abstractNum>
-  <w:abstractNum w:abstractNumId="42" w15:restartNumberingAfterBreak="0">
+  <w:abstractNum w:abstractNumId="47" w15:restartNumberingAfterBreak="0">
     <w:nsid w:val="6D5D52EC"/>
     <w:multiLevelType w:val="hybridMultilevel"/>
     <w:tmpl w:val="E90C2842"/>
@@ -25919,7 +28411,7 @@
       </w:rPr>
     </w:lvl>
   </w:abstractNum>
-  <w:abstractNum w:abstractNumId="43" w15:restartNumberingAfterBreak="0">
+  <w:abstractNum w:abstractNumId="48" w15:restartNumberingAfterBreak="0">
     <w:nsid w:val="70165319"/>
     <w:multiLevelType w:val="multilevel"/>
     <w:tmpl w:val="59EE7408"/>
@@ -26068,7 +28560,7 @@
       </w:rPr>
     </w:lvl>
   </w:abstractNum>
-  <w:abstractNum w:abstractNumId="44" w15:restartNumberingAfterBreak="0">
+  <w:abstractNum w:abstractNumId="49" w15:restartNumberingAfterBreak="0">
     <w:nsid w:val="7054229B"/>
     <w:multiLevelType w:val="multilevel"/>
     <w:tmpl w:val="9BA80258"/>
@@ -26217,7 +28709,7 @@
       </w:rPr>
     </w:lvl>
   </w:abstractNum>
-  <w:abstractNum w:abstractNumId="45" w15:restartNumberingAfterBreak="0">
+  <w:abstractNum w:abstractNumId="50" w15:restartNumberingAfterBreak="0">
     <w:nsid w:val="70A5488B"/>
     <w:multiLevelType w:val="multilevel"/>
     <w:tmpl w:val="70863E36"/>
@@ -26366,7 +28858,7 @@
       </w:rPr>
     </w:lvl>
   </w:abstractNum>
-  <w:abstractNum w:abstractNumId="46" w15:restartNumberingAfterBreak="0">
+  <w:abstractNum w:abstractNumId="51" w15:restartNumberingAfterBreak="0">
     <w:nsid w:val="71FF01D2"/>
     <w:multiLevelType w:val="multilevel"/>
     <w:tmpl w:val="1340EDC2"/>
@@ -26515,7 +29007,7 @@
       </w:rPr>
     </w:lvl>
   </w:abstractNum>
-  <w:abstractNum w:abstractNumId="47" w15:restartNumberingAfterBreak="0">
+  <w:abstractNum w:abstractNumId="52" w15:restartNumberingAfterBreak="0">
     <w:nsid w:val="7209128E"/>
     <w:multiLevelType w:val="multilevel"/>
     <w:tmpl w:val="2C226676"/>
@@ -26664,7 +29156,7 @@
       </w:rPr>
     </w:lvl>
   </w:abstractNum>
-  <w:abstractNum w:abstractNumId="48" w15:restartNumberingAfterBreak="0">
+  <w:abstractNum w:abstractNumId="53" w15:restartNumberingAfterBreak="0">
     <w:nsid w:val="73282710"/>
     <w:multiLevelType w:val="hybridMultilevel"/>
     <w:tmpl w:val="6DACE2D4"/>
@@ -26777,7 +29269,7 @@
       </w:rPr>
     </w:lvl>
   </w:abstractNum>
-  <w:abstractNum w:abstractNumId="49" w15:restartNumberingAfterBreak="0">
+  <w:abstractNum w:abstractNumId="54" w15:restartNumberingAfterBreak="0">
     <w:nsid w:val="73CA5D99"/>
     <w:multiLevelType w:val="multilevel"/>
     <w:tmpl w:val="17264AFA"/>
@@ -26926,7 +29418,7 @@
       </w:rPr>
     </w:lvl>
   </w:abstractNum>
-  <w:abstractNum w:abstractNumId="50" w15:restartNumberingAfterBreak="0">
+  <w:abstractNum w:abstractNumId="55" w15:restartNumberingAfterBreak="0">
     <w:nsid w:val="740F3DFB"/>
     <w:multiLevelType w:val="hybridMultilevel"/>
     <w:tmpl w:val="FBE4F368"/>
@@ -27039,7 +29531,7 @@
       </w:rPr>
     </w:lvl>
   </w:abstractNum>
-  <w:abstractNum w:abstractNumId="51" w15:restartNumberingAfterBreak="0">
+  <w:abstractNum w:abstractNumId="56" w15:restartNumberingAfterBreak="0">
     <w:nsid w:val="765F6BF7"/>
     <w:multiLevelType w:val="hybridMultilevel"/>
     <w:tmpl w:val="534AA04A"/>
@@ -27152,7 +29644,7 @@
       </w:rPr>
     </w:lvl>
   </w:abstractNum>
-  <w:abstractNum w:abstractNumId="52" w15:restartNumberingAfterBreak="0">
+  <w:abstractNum w:abstractNumId="57" w15:restartNumberingAfterBreak="0">
     <w:nsid w:val="77915556"/>
     <w:multiLevelType w:val="multilevel"/>
     <w:tmpl w:val="321A8944"/>
@@ -27301,7 +29793,7 @@
       </w:rPr>
     </w:lvl>
   </w:abstractNum>
-  <w:abstractNum w:abstractNumId="53" w15:restartNumberingAfterBreak="0">
+  <w:abstractNum w:abstractNumId="58" w15:restartNumberingAfterBreak="0">
     <w:nsid w:val="7BD85249"/>
     <w:multiLevelType w:val="multilevel"/>
     <w:tmpl w:val="20FCC93A"/>
@@ -27450,7 +29942,7 @@
       </w:rPr>
     </w:lvl>
   </w:abstractNum>
-  <w:abstractNum w:abstractNumId="54" w15:restartNumberingAfterBreak="0">
+  <w:abstractNum w:abstractNumId="59" w15:restartNumberingAfterBreak="0">
     <w:nsid w:val="7BEC50D1"/>
     <w:multiLevelType w:val="multilevel"/>
     <w:tmpl w:val="6BA8A7D6"/>
@@ -27599,7 +30091,7 @@
       </w:rPr>
     </w:lvl>
   </w:abstractNum>
-  <w:abstractNum w:abstractNumId="55" w15:restartNumberingAfterBreak="0">
+  <w:abstractNum w:abstractNumId="60" w15:restartNumberingAfterBreak="0">
     <w:nsid w:val="7E280834"/>
     <w:multiLevelType w:val="multilevel"/>
     <w:tmpl w:val="C52490A6"/>
@@ -27748,7 +30240,7 @@
       </w:rPr>
     </w:lvl>
   </w:abstractNum>
-  <w:abstractNum w:abstractNumId="56" w15:restartNumberingAfterBreak="0">
+  <w:abstractNum w:abstractNumId="61" w15:restartNumberingAfterBreak="0">
     <w:nsid w:val="7ED20FB3"/>
     <w:multiLevelType w:val="multilevel"/>
     <w:tmpl w:val="F55A27AE"/>
@@ -27898,175 +30390,190 @@
     </w:lvl>
   </w:abstractNum>
   <w:num w:numId="1" w16cid:durableId="321395444">
+    <w:abstractNumId w:val="31"/>
+  </w:num>
+  <w:num w:numId="2" w16cid:durableId="532154043">
+    <w:abstractNumId w:val="43"/>
+  </w:num>
+  <w:num w:numId="3" w16cid:durableId="798376593">
+    <w:abstractNumId w:val="56"/>
+  </w:num>
+  <w:num w:numId="4" w16cid:durableId="588386593">
+    <w:abstractNumId w:val="45"/>
+  </w:num>
+  <w:num w:numId="5" w16cid:durableId="70394061">
+    <w:abstractNumId w:val="34"/>
+  </w:num>
+  <w:num w:numId="6" w16cid:durableId="603196276">
+    <w:abstractNumId w:val="11"/>
+  </w:num>
+  <w:num w:numId="7" w16cid:durableId="19363175">
+    <w:abstractNumId w:val="18"/>
+  </w:num>
+  <w:num w:numId="8" w16cid:durableId="913007795">
+    <w:abstractNumId w:val="28"/>
+  </w:num>
+  <w:num w:numId="9" w16cid:durableId="368726822">
+    <w:abstractNumId w:val="5"/>
+  </w:num>
+  <w:num w:numId="10" w16cid:durableId="601228608">
+    <w:abstractNumId w:val="7"/>
+  </w:num>
+  <w:num w:numId="11" w16cid:durableId="680818838">
+    <w:abstractNumId w:val="12"/>
+  </w:num>
+  <w:num w:numId="12" w16cid:durableId="619728058">
+    <w:abstractNumId w:val="49"/>
+  </w:num>
+  <w:num w:numId="13" w16cid:durableId="1778989468">
+    <w:abstractNumId w:val="35"/>
+  </w:num>
+  <w:num w:numId="14" w16cid:durableId="2062170912">
+    <w:abstractNumId w:val="39"/>
+  </w:num>
+  <w:num w:numId="15" w16cid:durableId="585841409">
+    <w:abstractNumId w:val="30"/>
+  </w:num>
+  <w:num w:numId="16" w16cid:durableId="742529473">
+    <w:abstractNumId w:val="33"/>
+  </w:num>
+  <w:num w:numId="17" w16cid:durableId="1529947197">
+    <w:abstractNumId w:val="32"/>
+  </w:num>
+  <w:num w:numId="18" w16cid:durableId="1136332946">
+    <w:abstractNumId w:val="40"/>
+  </w:num>
+  <w:num w:numId="19" w16cid:durableId="1837695410">
+    <w:abstractNumId w:val="54"/>
+  </w:num>
+  <w:num w:numId="20" w16cid:durableId="1948609915">
+    <w:abstractNumId w:val="41"/>
+  </w:num>
+  <w:num w:numId="21" w16cid:durableId="1189296525">
+    <w:abstractNumId w:val="13"/>
+  </w:num>
+  <w:num w:numId="22" w16cid:durableId="83386017">
+    <w:abstractNumId w:val="53"/>
+  </w:num>
+  <w:num w:numId="23" w16cid:durableId="662245281">
+    <w:abstractNumId w:val="46"/>
+  </w:num>
+  <w:num w:numId="24" w16cid:durableId="972716946">
+    <w:abstractNumId w:val="17"/>
+  </w:num>
+  <w:num w:numId="25" w16cid:durableId="531382493">
     <w:abstractNumId w:val="26"/>
   </w:num>
-  <w:num w:numId="2" w16cid:durableId="532154043">
+  <w:num w:numId="26" w16cid:durableId="404649494">
+    <w:abstractNumId w:val="4"/>
+  </w:num>
+  <w:num w:numId="27" w16cid:durableId="1527138778">
+    <w:abstractNumId w:val="6"/>
+  </w:num>
+  <w:num w:numId="28" w16cid:durableId="1635595833">
+    <w:abstractNumId w:val="15"/>
+  </w:num>
+  <w:num w:numId="29" w16cid:durableId="654845484">
+    <w:abstractNumId w:val="59"/>
+  </w:num>
+  <w:num w:numId="30" w16cid:durableId="1119686817">
+    <w:abstractNumId w:val="36"/>
+  </w:num>
+  <w:num w:numId="31" w16cid:durableId="1883783816">
+    <w:abstractNumId w:val="29"/>
+  </w:num>
+  <w:num w:numId="32" w16cid:durableId="2082944841">
+    <w:abstractNumId w:val="20"/>
+  </w:num>
+  <w:num w:numId="33" w16cid:durableId="410852690">
+    <w:abstractNumId w:val="14"/>
+  </w:num>
+  <w:num w:numId="34" w16cid:durableId="767652689">
+    <w:abstractNumId w:val="19"/>
+  </w:num>
+  <w:num w:numId="35" w16cid:durableId="1766262408">
+    <w:abstractNumId w:val="10"/>
+  </w:num>
+  <w:num w:numId="36" w16cid:durableId="1329208245">
+    <w:abstractNumId w:val="16"/>
+  </w:num>
+  <w:num w:numId="37" w16cid:durableId="560362349">
+    <w:abstractNumId w:val="58"/>
+  </w:num>
+  <w:num w:numId="38" w16cid:durableId="1106999145">
+    <w:abstractNumId w:val="44"/>
+  </w:num>
+  <w:num w:numId="39" w16cid:durableId="1767268650">
+    <w:abstractNumId w:val="42"/>
+  </w:num>
+  <w:num w:numId="40" w16cid:durableId="1580745284">
+    <w:abstractNumId w:val="60"/>
+  </w:num>
+  <w:num w:numId="41" w16cid:durableId="1432314249">
+    <w:abstractNumId w:val="51"/>
+  </w:num>
+  <w:num w:numId="42" w16cid:durableId="1656954061">
+    <w:abstractNumId w:val="61"/>
+  </w:num>
+  <w:num w:numId="43" w16cid:durableId="545684341">
+    <w:abstractNumId w:val="37"/>
+  </w:num>
+  <w:num w:numId="44" w16cid:durableId="1724526892">
+    <w:abstractNumId w:val="25"/>
+  </w:num>
+  <w:num w:numId="45" w16cid:durableId="1747998984">
+    <w:abstractNumId w:val="8"/>
+  </w:num>
+  <w:num w:numId="46" w16cid:durableId="1480536064">
+    <w:abstractNumId w:val="27"/>
+  </w:num>
+  <w:num w:numId="47" w16cid:durableId="988629120">
+    <w:abstractNumId w:val="21"/>
+  </w:num>
+  <w:num w:numId="48" w16cid:durableId="2023891085">
+    <w:abstractNumId w:val="50"/>
+  </w:num>
+  <w:num w:numId="49" w16cid:durableId="644941106">
+    <w:abstractNumId w:val="55"/>
+  </w:num>
+  <w:num w:numId="50" w16cid:durableId="1786921595">
+    <w:abstractNumId w:val="23"/>
+  </w:num>
+  <w:num w:numId="51" w16cid:durableId="1527021194">
+    <w:abstractNumId w:val="2"/>
+  </w:num>
+  <w:num w:numId="52" w16cid:durableId="261651849">
+    <w:abstractNumId w:val="52"/>
+  </w:num>
+  <w:num w:numId="53" w16cid:durableId="2028481914">
+    <w:abstractNumId w:val="48"/>
+  </w:num>
+  <w:num w:numId="54" w16cid:durableId="1186479370">
+    <w:abstractNumId w:val="57"/>
+  </w:num>
+  <w:num w:numId="55" w16cid:durableId="1356999818">
     <w:abstractNumId w:val="38"/>
   </w:num>
-  <w:num w:numId="3" w16cid:durableId="798376593">
-    <w:abstractNumId w:val="51"/>
-  </w:num>
-  <w:num w:numId="4" w16cid:durableId="588386593">
-    <w:abstractNumId w:val="40"/>
-  </w:num>
-  <w:num w:numId="5" w16cid:durableId="70394061">
-    <w:abstractNumId w:val="29"/>
-  </w:num>
-  <w:num w:numId="6" w16cid:durableId="603196276">
-    <w:abstractNumId w:val="8"/>
-  </w:num>
-  <w:num w:numId="7" w16cid:durableId="19363175">
-    <w:abstractNumId w:val="15"/>
-  </w:num>
-  <w:num w:numId="8" w16cid:durableId="913007795">
-    <w:abstractNumId w:val="23"/>
-  </w:num>
-  <w:num w:numId="9" w16cid:durableId="368726822">
+  <w:num w:numId="56" w16cid:durableId="1831948763">
     <w:abstractNumId w:val="3"/>
   </w:num>
-  <w:num w:numId="10" w16cid:durableId="601228608">
-    <w:abstractNumId w:val="5"/>
+  <w:num w:numId="57" w16cid:durableId="1684285184">
+    <w:abstractNumId w:val="47"/>
   </w:num>
-  <w:num w:numId="11" w16cid:durableId="680818838">
+  <w:num w:numId="58" w16cid:durableId="1681275129">
+    <w:abstractNumId w:val="24"/>
+  </w:num>
+  <w:num w:numId="59" w16cid:durableId="1646810551">
+    <w:abstractNumId w:val="0"/>
+  </w:num>
+  <w:num w:numId="60" w16cid:durableId="546187397">
     <w:abstractNumId w:val="9"/>
   </w:num>
-  <w:num w:numId="12" w16cid:durableId="619728058">
-    <w:abstractNumId w:val="44"/>
-  </w:num>
-  <w:num w:numId="13" w16cid:durableId="1778989468">
-    <w:abstractNumId w:val="30"/>
-  </w:num>
-  <w:num w:numId="14" w16cid:durableId="2062170912">
-    <w:abstractNumId w:val="34"/>
-  </w:num>
-  <w:num w:numId="15" w16cid:durableId="585841409">
-    <w:abstractNumId w:val="25"/>
-  </w:num>
-  <w:num w:numId="16" w16cid:durableId="742529473">
-    <w:abstractNumId w:val="28"/>
-  </w:num>
-  <w:num w:numId="17" w16cid:durableId="1529947197">
-    <w:abstractNumId w:val="27"/>
-  </w:num>
-  <w:num w:numId="18" w16cid:durableId="1136332946">
-    <w:abstractNumId w:val="35"/>
-  </w:num>
-  <w:num w:numId="19" w16cid:durableId="1837695410">
-    <w:abstractNumId w:val="49"/>
-  </w:num>
-  <w:num w:numId="20" w16cid:durableId="1948609915">
-    <w:abstractNumId w:val="36"/>
-  </w:num>
-  <w:num w:numId="21" w16cid:durableId="1189296525">
-    <w:abstractNumId w:val="10"/>
-  </w:num>
-  <w:num w:numId="22" w16cid:durableId="83386017">
-    <w:abstractNumId w:val="48"/>
-  </w:num>
-  <w:num w:numId="23" w16cid:durableId="662245281">
-    <w:abstractNumId w:val="41"/>
-  </w:num>
-  <w:num w:numId="24" w16cid:durableId="972716946">
-    <w:abstractNumId w:val="14"/>
-  </w:num>
-  <w:num w:numId="25" w16cid:durableId="531382493">
-    <w:abstractNumId w:val="21"/>
-  </w:num>
-  <w:num w:numId="26" w16cid:durableId="404649494">
-    <w:abstractNumId w:val="2"/>
-  </w:num>
-  <w:num w:numId="27" w16cid:durableId="1527138778">
-    <w:abstractNumId w:val="4"/>
-  </w:num>
-  <w:num w:numId="28" w16cid:durableId="1635595833">
-    <w:abstractNumId w:val="12"/>
-  </w:num>
-  <w:num w:numId="29" w16cid:durableId="654845484">
-    <w:abstractNumId w:val="54"/>
-  </w:num>
-  <w:num w:numId="30" w16cid:durableId="1119686817">
-    <w:abstractNumId w:val="31"/>
-  </w:num>
-  <w:num w:numId="31" w16cid:durableId="1883783816">
-    <w:abstractNumId w:val="24"/>
-  </w:num>
-  <w:num w:numId="32" w16cid:durableId="2082944841">
-    <w:abstractNumId w:val="17"/>
-  </w:num>
-  <w:num w:numId="33" w16cid:durableId="410852690">
-    <w:abstractNumId w:val="11"/>
-  </w:num>
-  <w:num w:numId="34" w16cid:durableId="767652689">
-    <w:abstractNumId w:val="16"/>
-  </w:num>
-  <w:num w:numId="35" w16cid:durableId="1766262408">
-    <w:abstractNumId w:val="7"/>
-  </w:num>
-  <w:num w:numId="36" w16cid:durableId="1329208245">
-    <w:abstractNumId w:val="13"/>
-  </w:num>
-  <w:num w:numId="37" w16cid:durableId="560362349">
-    <w:abstractNumId w:val="53"/>
-  </w:num>
-  <w:num w:numId="38" w16cid:durableId="1106999145">
-    <w:abstractNumId w:val="39"/>
-  </w:num>
-  <w:num w:numId="39" w16cid:durableId="1767268650">
-    <w:abstractNumId w:val="37"/>
-  </w:num>
-  <w:num w:numId="40" w16cid:durableId="1580745284">
-    <w:abstractNumId w:val="55"/>
-  </w:num>
-  <w:num w:numId="41" w16cid:durableId="1432314249">
-    <w:abstractNumId w:val="46"/>
-  </w:num>
-  <w:num w:numId="42" w16cid:durableId="1656954061">
-    <w:abstractNumId w:val="56"/>
-  </w:num>
-  <w:num w:numId="43" w16cid:durableId="545684341">
-    <w:abstractNumId w:val="32"/>
-  </w:num>
-  <w:num w:numId="44" w16cid:durableId="1724526892">
-    <w:abstractNumId w:val="20"/>
-  </w:num>
-  <w:num w:numId="45" w16cid:durableId="1747998984">
-    <w:abstractNumId w:val="6"/>
-  </w:num>
-  <w:num w:numId="46" w16cid:durableId="1480536064">
-    <w:abstractNumId w:val="22"/>
-  </w:num>
-  <w:num w:numId="47" w16cid:durableId="988629120">
-    <w:abstractNumId w:val="18"/>
-  </w:num>
-  <w:num w:numId="48" w16cid:durableId="2023891085">
-    <w:abstractNumId w:val="45"/>
-  </w:num>
-  <w:num w:numId="49" w16cid:durableId="644941106">
-    <w:abstractNumId w:val="50"/>
-  </w:num>
-  <w:num w:numId="50" w16cid:durableId="1786921595">
-    <w:abstractNumId w:val="19"/>
-  </w:num>
-  <w:num w:numId="51" w16cid:durableId="1527021194">
-    <w:abstractNumId w:val="0"/>
-  </w:num>
-  <w:num w:numId="52" w16cid:durableId="261651849">
-    <w:abstractNumId w:val="47"/>
-  </w:num>
-  <w:num w:numId="53" w16cid:durableId="2028481914">
-    <w:abstractNumId w:val="43"/>
-  </w:num>
-  <w:num w:numId="54" w16cid:durableId="1186479370">
-    <w:abstractNumId w:val="52"/>
-  </w:num>
-  <w:num w:numId="55" w16cid:durableId="1356999818">
-    <w:abstractNumId w:val="33"/>
-  </w:num>
-  <w:num w:numId="56" w16cid:durableId="1831948763">
+  <w:num w:numId="61" w16cid:durableId="1181286454">
     <w:abstractNumId w:val="1"/>
   </w:num>
-  <w:num w:numId="57" w16cid:durableId="1684285184">
-    <w:abstractNumId w:val="42"/>
+  <w:num w:numId="62" w16cid:durableId="1089958536">
+    <w:abstractNumId w:val="22"/>
   </w:num>
 </w:numbering>
 </file>
@@ -28674,7 +31181,6 @@
   <w:style w:type="character" w:default="1" w:styleId="DefaultParagraphFont">
     <w:name w:val="Default Paragraph Font"/>
     <w:uiPriority w:val="1"/>
-    <w:semiHidden/>
     <w:unhideWhenUsed/>
   </w:style>
   <w:style w:type="table" w:default="1" w:styleId="TableNormal">

</xml_diff>